<commit_message>
feat: add lab3 code and diagrams
</commit_message>
<xml_diff>
--- a/lab3/лабthree.docx
+++ b/lab3/лабthree.docx
@@ -418,7 +418,7 @@
           </mc:Choice>
           <mc:Fallback>
             <w:pict>
-              <v:group w14:anchorId="50618745" id="Group 4135" o:spid="_x0000_s1026" style="width:275.1pt;height:1pt;mso-position-horizontal-relative:char;mso-position-vertical-relative:line" coordsize="34936,127" o:gfxdata="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">
+              <v:group w14:anchorId="13ECEB15" id="Group 4135" o:spid="_x0000_s1026" style="width:275.1pt;height:1pt;mso-position-horizontal-relative:char;mso-position-vertical-relative:line" coordsize="34936,127" o:gfxdata="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">
                 <v:shape id="Shape 19" o:spid="_x0000_s1027" style="position:absolute;width:34936;height:0;visibility:visible;mso-wrap-style:square;v-text-anchor:top" coordsize="3493620,0" o:gfxdata="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" path="m,l3493620,e" filled="f" strokeweight="1pt">
                   <v:stroke miterlimit="1" joinstyle="miter"/>
                   <v:path arrowok="t" textboxrect="0,0,3493620,0"/>
@@ -548,7 +548,7 @@
           </mc:Choice>
           <mc:Fallback>
             <w:pict>
-              <v:group w14:anchorId="6EAFD1B7" id="Group 4136" o:spid="_x0000_s1026" style="width:275.1pt;height:1pt;mso-position-horizontal-relative:char;mso-position-vertical-relative:line" coordsize="34936,127" o:gfxdata="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">
+              <v:group w14:anchorId="72BC3304" id="Group 4136" o:spid="_x0000_s1026" style="width:275.1pt;height:1pt;mso-position-horizontal-relative:char;mso-position-vertical-relative:line" coordsize="34936,127" o:gfxdata="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">
                 <v:shape id="Shape 22" o:spid="_x0000_s1027" style="position:absolute;width:34936;height:0;visibility:visible;mso-wrap-style:square;v-text-anchor:top" coordsize="3493620,0" o:gfxdata="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" path="m,l3493620,e" filled="f" strokeweight="1pt">
                   <v:stroke miterlimit="1" joinstyle="miter"/>
                   <v:path arrowok="t" textboxrect="0,0,3493620,0"/>
@@ -803,7 +803,7 @@
                     <pic:cNvPicPr/>
                   </pic:nvPicPr>
                   <pic:blipFill>
-                    <a:blip r:embed="rId6"/>
+                    <a:blip r:embed="rId8"/>
                     <a:stretch>
                       <a:fillRect/>
                     </a:stretch>
@@ -948,445 +948,6 @@
             <wp:extent cx="5249008" cy="2800741"/>
             <wp:effectExtent l="0" t="0" r="8890" b="0"/>
             <wp:docPr id="5" name="Рисунок 5"/>
-            <wp:cNvGraphicFramePr>
-              <a:graphicFrameLocks xmlns:a="http://schemas.openxmlformats.org/drawingml/2006/main" noChangeAspect="1"/>
-            </wp:cNvGraphicFramePr>
-            <a:graphic xmlns:a="http://schemas.openxmlformats.org/drawingml/2006/main">
-              <a:graphicData uri="http://schemas.openxmlformats.org/drawingml/2006/picture">
-                <pic:pic xmlns:pic="http://schemas.openxmlformats.org/drawingml/2006/picture">
-                  <pic:nvPicPr>
-                    <pic:cNvPr id="1" name=""/>
-                    <pic:cNvPicPr/>
-                  </pic:nvPicPr>
-                  <pic:blipFill>
-                    <a:blip r:embed="rId7"/>
-                    <a:stretch>
-                      <a:fillRect/>
-                    </a:stretch>
-                  </pic:blipFill>
-                  <pic:spPr>
-                    <a:xfrm>
-                      <a:off x="0" y="0"/>
-                      <a:ext cx="5249008" cy="2800741"/>
-                    </a:xfrm>
-                    <a:prstGeom prst="rect">
-                      <a:avLst/>
-                    </a:prstGeom>
-                  </pic:spPr>
-                </pic:pic>
-              </a:graphicData>
-            </a:graphic>
-          </wp:inline>
-        </w:drawing>
-      </w:r>
-    </w:p>
-    <w:p>
-      <w:pPr>
-        <w:spacing w:after="120" w:line="360" w:lineRule="auto"/>
-        <w:ind w:firstLine="709"/>
-        <w:jc w:val="center"/>
-        <w:rPr>
-          <w:sz w:val="24"/>
-          <w:szCs w:val="24"/>
-          <w:lang w:val="ru-RU"/>
-        </w:rPr>
-      </w:pPr>
-      <w:r>
-        <w:rPr>
-          <w:rFonts w:ascii="Times New Roman" w:hAnsi="Times New Roman"/>
-          <w:color w:val="000000"/>
-          <w:sz w:val="24"/>
-          <w:szCs w:val="24"/>
-          <w:lang w:val="ru-RU"/>
-        </w:rPr>
-        <w:t xml:space="preserve">Рисунок </w:t>
-      </w:r>
-      <w:r>
-        <w:rPr>
-          <w:rFonts w:ascii="Times New Roman" w:hAnsi="Times New Roman"/>
-          <w:color w:val="000000"/>
-          <w:sz w:val="24"/>
-          <w:szCs w:val="24"/>
-          <w:lang w:val="ru-RU"/>
-        </w:rPr>
-        <w:t>2</w:t>
-      </w:r>
-      <w:r>
-        <w:rPr>
-          <w:rFonts w:ascii="Times New Roman" w:hAnsi="Times New Roman"/>
-          <w:color w:val="000000"/>
-          <w:sz w:val="24"/>
-          <w:szCs w:val="24"/>
-          <w:lang w:val="ru-RU"/>
-        </w:rPr>
-        <w:t xml:space="preserve"> </w:t>
-      </w:r>
-      <w:r>
-        <w:rPr>
-          <w:rFonts w:ascii="Times New Roman" w:hAnsi="Times New Roman"/>
-          <w:color w:val="000000"/>
-          <w:sz w:val="24"/>
-          <w:szCs w:val="24"/>
-          <w:lang w:val="ru-RU"/>
-        </w:rPr>
-        <w:t>–</w:t>
-      </w:r>
-      <w:r>
-        <w:rPr>
-          <w:rFonts w:ascii="Times New Roman" w:hAnsi="Times New Roman"/>
-          <w:color w:val="000000"/>
-          <w:sz w:val="24"/>
-          <w:szCs w:val="24"/>
-          <w:lang w:val="ru-RU"/>
-        </w:rPr>
-        <w:t xml:space="preserve"> </w:t>
-      </w:r>
-      <w:r>
-        <w:rPr>
-          <w:rFonts w:ascii="Times New Roman" w:hAnsi="Times New Roman"/>
-          <w:color w:val="000000"/>
-          <w:sz w:val="24"/>
-          <w:szCs w:val="24"/>
-          <w:lang w:val="ru-RU"/>
-        </w:rPr>
-        <w:t>Текст программы</w:t>
-      </w:r>
-      <w:r>
-        <w:rPr>
-          <w:rFonts w:ascii="Times New Roman" w:hAnsi="Times New Roman"/>
-          <w:color w:val="000000"/>
-          <w:sz w:val="24"/>
-          <w:szCs w:val="24"/>
-          <w:lang w:val="ru-RU"/>
-        </w:rPr>
-        <w:t xml:space="preserve"> </w:t>
-      </w:r>
-      <w:r>
-        <w:rPr>
-          <w:rFonts w:ascii="Times New Roman" w:hAnsi="Times New Roman"/>
-          <w:color w:val="000000"/>
-          <w:sz w:val="24"/>
-          <w:szCs w:val="24"/>
-        </w:rPr>
-        <w:t>task</w:t>
-      </w:r>
-      <w:r>
-        <w:rPr>
-          <w:rFonts w:ascii="Times New Roman" w:hAnsi="Times New Roman"/>
-          <w:color w:val="000000"/>
-          <w:sz w:val="24"/>
-          <w:szCs w:val="24"/>
-          <w:lang w:val="ru-RU"/>
-        </w:rPr>
-        <w:t>3</w:t>
-      </w:r>
-      <w:r>
-        <w:rPr>
-          <w:rFonts w:ascii="Times New Roman" w:hAnsi="Times New Roman"/>
-          <w:color w:val="000000"/>
-          <w:sz w:val="24"/>
-          <w:szCs w:val="24"/>
-          <w:lang w:val="ru-RU"/>
-        </w:rPr>
-        <w:t>1.</w:t>
-      </w:r>
-      <w:proofErr w:type="spellStart"/>
-      <w:r>
-        <w:rPr>
-          <w:rFonts w:ascii="Times New Roman" w:hAnsi="Times New Roman"/>
-          <w:color w:val="000000"/>
-          <w:sz w:val="24"/>
-          <w:szCs w:val="24"/>
-        </w:rPr>
-        <w:t>py</w:t>
-      </w:r>
-      <w:proofErr w:type="spellEnd"/>
-    </w:p>
-    <w:p>
-      <w:pPr>
-        <w:spacing w:after="0" w:line="360" w:lineRule="auto"/>
-        <w:ind w:firstLine="709"/>
-        <w:jc w:val="both"/>
-        <w:rPr>
-          <w:rFonts w:ascii="Times New Roman" w:hAnsi="Times New Roman" w:cs="Times New Roman"/>
-          <w:sz w:val="24"/>
-          <w:szCs w:val="24"/>
-        </w:rPr>
-      </w:pPr>
-      <w:r>
-        <w:rPr>
-          <w:rFonts w:ascii="Times New Roman" w:hAnsi="Times New Roman" w:cs="Times New Roman"/>
-          <w:sz w:val="24"/>
-          <w:szCs w:val="24"/>
-          <w:lang w:val="ru-RU"/>
-        </w:rPr>
-        <w:t>В данном задании программа принимает от пользователя строку кода документа, разделяет ее на фиксированные сегменты с помощью механизма срезов по индексам и выводит полученные данные. Ведущие нули сохраняются благодаря обработке данных в строковом типе.</w:t>
-      </w:r>
-    </w:p>
-    <w:p>
-      <w:pPr>
-        <w:spacing w:before="240" w:after="120" w:line="240" w:lineRule="auto"/>
-        <w:ind w:firstLine="709"/>
-        <w:jc w:val="both"/>
-        <w:rPr>
-          <w:rFonts w:ascii="Arial" w:hAnsi="Arial" w:cs="Arial"/>
-          <w:color w:val="000000"/>
-          <w:sz w:val="26"/>
-          <w:szCs w:val="26"/>
-          <w:lang w:val="ru-RU"/>
-        </w:rPr>
-      </w:pPr>
-      <w:r>
-        <w:rPr>
-          <w:rFonts w:ascii="Arial" w:hAnsi="Arial" w:cs="Arial"/>
-          <w:color w:val="000000"/>
-          <w:sz w:val="26"/>
-          <w:szCs w:val="26"/>
-          <w:lang w:val="ru-RU"/>
-        </w:rPr>
-        <w:t xml:space="preserve">1.2 </w:t>
-      </w:r>
-      <w:r>
-        <w:rPr>
-          <w:rFonts w:ascii="Arial" w:hAnsi="Arial" w:cs="Arial"/>
-          <w:color w:val="000000"/>
-          <w:sz w:val="26"/>
-          <w:szCs w:val="26"/>
-          <w:lang w:val="ru-RU"/>
-        </w:rPr>
-        <w:t>Форматирование имени</w:t>
-      </w:r>
-    </w:p>
-    <w:p>
-      <w:pPr>
-        <w:spacing w:after="0" w:line="360" w:lineRule="auto"/>
-        <w:ind w:firstLine="709"/>
-        <w:jc w:val="both"/>
-        <w:rPr>
-          <w:rFonts w:ascii="Times New Roman" w:hAnsi="Times New Roman" w:cs="Times New Roman"/>
-          <w:sz w:val="24"/>
-          <w:szCs w:val="24"/>
-          <w:lang w:val="ru-RU"/>
-        </w:rPr>
-      </w:pPr>
-      <w:r>
-        <w:rPr>
-          <w:rFonts w:ascii="Times New Roman" w:hAnsi="Times New Roman" w:cs="Times New Roman"/>
-          <w:sz w:val="24"/>
-          <w:szCs w:val="24"/>
-          <w:lang w:val="ru-RU"/>
-        </w:rPr>
-        <w:t>Во втором задании пользователь вводит фамилию, имя и отчество одной строкой с произвольным регистром букв и переменным количеством пробелов. Программа должна выполнить очистку строки, сделать первую букву фамилии заглавной, а остальные строчными, после чего извлечь заглавные инициалы имени и отчества с точками.</w:t>
-      </w:r>
-    </w:p>
-    <w:p>
-      <w:pPr>
-        <w:spacing w:after="0" w:line="360" w:lineRule="auto"/>
-        <w:ind w:firstLine="709"/>
-        <w:jc w:val="both"/>
-        <w:rPr>
-          <w:rFonts w:ascii="Times New Roman" w:hAnsi="Times New Roman" w:cs="Times New Roman"/>
-          <w:sz w:val="24"/>
-          <w:szCs w:val="24"/>
-          <w:lang w:val="ru-RU"/>
-        </w:rPr>
-      </w:pPr>
-      <w:r>
-        <w:rPr>
-          <w:rFonts w:ascii="Times New Roman" w:hAnsi="Times New Roman" w:cs="Times New Roman"/>
-          <w:sz w:val="24"/>
-          <w:szCs w:val="24"/>
-          <w:lang w:val="ru-RU"/>
-        </w:rPr>
-        <w:t xml:space="preserve">Алгоритм решения задания </w:t>
-      </w:r>
-      <w:r>
-        <w:rPr>
-          <w:rFonts w:ascii="Times New Roman" w:hAnsi="Times New Roman" w:cs="Times New Roman"/>
-          <w:sz w:val="24"/>
-          <w:szCs w:val="24"/>
-          <w:lang w:val="ru-RU"/>
-        </w:rPr>
-        <w:t>представлен на рисунке 3.</w:t>
-      </w:r>
-    </w:p>
-    <w:p>
-      <w:pPr>
-        <w:spacing w:after="80" w:line="360" w:lineRule="auto"/>
-        <w:ind w:firstLine="709"/>
-        <w:jc w:val="center"/>
-        <w:rPr>
-          <w:rFonts w:ascii="Times New Roman" w:hAnsi="Times New Roman" w:cs="Times New Roman"/>
-          <w:sz w:val="24"/>
-          <w:szCs w:val="24"/>
-          <w:lang w:val="ru-RU"/>
-        </w:rPr>
-      </w:pPr>
-      <w:r>
-        <w:rPr>
-          <w:rFonts w:ascii="Times New Roman" w:hAnsi="Times New Roman" w:cs="Times New Roman"/>
-          <w:noProof/>
-          <w:sz w:val="24"/>
-          <w:szCs w:val="24"/>
-          <w:lang w:val="ru-RU"/>
-        </w:rPr>
-        <w:lastRenderedPageBreak/>
-        <w:drawing>
-          <wp:inline distT="0" distB="0" distL="0" distR="0" wp14:anchorId="2BC6E1C6" wp14:editId="5B847267">
-            <wp:extent cx="2400300" cy="4876800"/>
-            <wp:effectExtent l="0" t="0" r="0" b="0"/>
-            <wp:docPr id="6" name="Рисунок 6"/>
-            <wp:cNvGraphicFramePr>
-              <a:graphicFrameLocks xmlns:a="http://schemas.openxmlformats.org/drawingml/2006/main" noChangeAspect="1"/>
-            </wp:cNvGraphicFramePr>
-            <a:graphic xmlns:a="http://schemas.openxmlformats.org/drawingml/2006/main">
-              <a:graphicData uri="http://schemas.openxmlformats.org/drawingml/2006/picture">
-                <pic:pic xmlns:pic="http://schemas.openxmlformats.org/drawingml/2006/picture">
-                  <pic:nvPicPr>
-                    <pic:cNvPr id="6" name="Рисунок 6"/>
-                    <pic:cNvPicPr/>
-                  </pic:nvPicPr>
-                  <pic:blipFill>
-                    <a:blip r:embed="rId8"/>
-                    <a:stretch>
-                      <a:fillRect/>
-                    </a:stretch>
-                  </pic:blipFill>
-                  <pic:spPr>
-                    <a:xfrm>
-                      <a:off x="0" y="0"/>
-                      <a:ext cx="2400300" cy="4876800"/>
-                    </a:xfrm>
-                    <a:prstGeom prst="rect">
-                      <a:avLst/>
-                    </a:prstGeom>
-                  </pic:spPr>
-                </pic:pic>
-              </a:graphicData>
-            </a:graphic>
-          </wp:inline>
-        </w:drawing>
-      </w:r>
-    </w:p>
-    <w:p>
-      <w:pPr>
-        <w:spacing w:before="80" w:after="120" w:line="360" w:lineRule="auto"/>
-        <w:ind w:firstLine="709"/>
-        <w:jc w:val="center"/>
-        <w:rPr>
-          <w:rFonts w:ascii="Times New Roman" w:hAnsi="Times New Roman"/>
-          <w:color w:val="000000"/>
-          <w:sz w:val="24"/>
-          <w:szCs w:val="24"/>
-          <w:lang w:val="ru-RU"/>
-        </w:rPr>
-      </w:pPr>
-      <w:r>
-        <w:rPr>
-          <w:rFonts w:ascii="Times New Roman" w:hAnsi="Times New Roman"/>
-          <w:color w:val="000000"/>
-          <w:sz w:val="24"/>
-          <w:szCs w:val="24"/>
-          <w:lang w:val="ru-RU"/>
-        </w:rPr>
-        <w:t xml:space="preserve">Рисунок </w:t>
-      </w:r>
-      <w:r>
-        <w:rPr>
-          <w:rFonts w:ascii="Times New Roman" w:hAnsi="Times New Roman"/>
-          <w:color w:val="000000"/>
-          <w:sz w:val="24"/>
-          <w:szCs w:val="24"/>
-          <w:lang w:val="ru-RU"/>
-        </w:rPr>
-        <w:t>3</w:t>
-      </w:r>
-      <w:r>
-        <w:rPr>
-          <w:rFonts w:ascii="Times New Roman" w:hAnsi="Times New Roman"/>
-          <w:color w:val="000000"/>
-          <w:sz w:val="24"/>
-          <w:szCs w:val="24"/>
-          <w:lang w:val="ru-RU"/>
-        </w:rPr>
-        <w:t xml:space="preserve"> </w:t>
-      </w:r>
-      <w:r>
-        <w:rPr>
-          <w:rFonts w:ascii="Times New Roman" w:hAnsi="Times New Roman"/>
-          <w:color w:val="000000"/>
-          <w:sz w:val="24"/>
-          <w:szCs w:val="24"/>
-          <w:lang w:val="ru-RU"/>
-        </w:rPr>
-        <w:t>–</w:t>
-      </w:r>
-      <w:r>
-        <w:rPr>
-          <w:rFonts w:ascii="Times New Roman" w:hAnsi="Times New Roman"/>
-          <w:color w:val="000000"/>
-          <w:sz w:val="24"/>
-          <w:szCs w:val="24"/>
-          <w:lang w:val="ru-RU"/>
-        </w:rPr>
-        <w:t xml:space="preserve"> </w:t>
-      </w:r>
-      <w:r>
-        <w:rPr>
-          <w:rFonts w:ascii="Times New Roman" w:hAnsi="Times New Roman"/>
-          <w:color w:val="000000"/>
-          <w:sz w:val="24"/>
-          <w:szCs w:val="24"/>
-          <w:lang w:val="ru-RU"/>
-        </w:rPr>
-        <w:t>Блок-схема программы</w:t>
-      </w:r>
-    </w:p>
-    <w:p>
-      <w:pPr>
-        <w:spacing w:before="80" w:after="120" w:line="360" w:lineRule="auto"/>
-        <w:ind w:firstLine="709"/>
-        <w:jc w:val="both"/>
-        <w:rPr>
-          <w:rFonts w:ascii="Times New Roman" w:hAnsi="Times New Roman"/>
-          <w:color w:val="000000"/>
-          <w:sz w:val="24"/>
-          <w:szCs w:val="24"/>
-          <w:lang w:val="ru-RU"/>
-        </w:rPr>
-      </w:pPr>
-      <w:r>
-        <w:rPr>
-          <w:rFonts w:ascii="Times New Roman" w:hAnsi="Times New Roman"/>
-          <w:color w:val="000000"/>
-          <w:sz w:val="24"/>
-          <w:szCs w:val="24"/>
-          <w:lang w:val="ru-RU"/>
-        </w:rPr>
-        <w:t>Текст программы представлен на рисунке 4.</w:t>
-      </w:r>
-    </w:p>
-    <w:p>
-      <w:pPr>
-        <w:spacing w:before="80" w:after="120" w:line="360" w:lineRule="auto"/>
-        <w:ind w:firstLine="709"/>
-        <w:rPr>
-          <w:sz w:val="24"/>
-          <w:szCs w:val="24"/>
-          <w:lang w:val="ru-RU"/>
-        </w:rPr>
-      </w:pPr>
-      <w:r>
-        <w:rPr>
-          <w:sz w:val="24"/>
-          <w:szCs w:val="24"/>
-          <w:lang w:val="ru-RU"/>
-        </w:rPr>
-        <w:drawing>
-          <wp:inline distT="0" distB="0" distL="0" distR="0" wp14:anchorId="74790F1B" wp14:editId="71852235">
-            <wp:extent cx="5518298" cy="1850390"/>
-            <wp:effectExtent l="0" t="0" r="6350" b="0"/>
-            <wp:docPr id="7" name="Рисунок 7"/>
             <wp:cNvGraphicFramePr>
               <a:graphicFrameLocks xmlns:a="http://schemas.openxmlformats.org/drawingml/2006/main" noChangeAspect="1"/>
             </wp:cNvGraphicFramePr>
@@ -1406,7 +967,7 @@
                   <pic:spPr>
                     <a:xfrm>
                       <a:off x="0" y="0"/>
-                      <a:ext cx="5522317" cy="1851738"/>
+                      <a:ext cx="5249008" cy="2800741"/>
                     </a:xfrm>
                     <a:prstGeom prst="rect">
                       <a:avLst/>
@@ -1421,23 +982,24 @@
     </w:p>
     <w:p>
       <w:pPr>
-        <w:spacing w:before="80" w:after="120" w:line="360" w:lineRule="auto"/>
+        <w:spacing w:after="120" w:line="360" w:lineRule="auto"/>
         <w:ind w:firstLine="709"/>
         <w:jc w:val="center"/>
         <w:rPr>
+          <w:sz w:val="24"/>
+          <w:szCs w:val="24"/>
+          <w:lang w:val="ru-RU"/>
+        </w:rPr>
+      </w:pPr>
+      <w:r>
+        <w:rPr>
           <w:rFonts w:ascii="Times New Roman" w:hAnsi="Times New Roman"/>
           <w:color w:val="000000"/>
           <w:sz w:val="24"/>
           <w:szCs w:val="24"/>
-        </w:rPr>
-      </w:pPr>
-      <w:r>
-        <w:rPr>
-          <w:sz w:val="24"/>
-          <w:szCs w:val="24"/>
-          <w:lang w:val="ru-RU"/>
-        </w:rPr>
-        <w:t xml:space="preserve">Рисунок 4 </w:t>
+          <w:lang w:val="ru-RU"/>
+        </w:rPr>
+        <w:t xml:space="preserve">Рисунок </w:t>
       </w:r>
       <w:r>
         <w:rPr>
@@ -1447,6 +1009,26 @@
           <w:szCs w:val="24"/>
           <w:lang w:val="ru-RU"/>
         </w:rPr>
+        <w:t>2</w:t>
+      </w:r>
+      <w:r>
+        <w:rPr>
+          <w:rFonts w:ascii="Times New Roman" w:hAnsi="Times New Roman"/>
+          <w:color w:val="000000"/>
+          <w:sz w:val="24"/>
+          <w:szCs w:val="24"/>
+          <w:lang w:val="ru-RU"/>
+        </w:rPr>
+        <w:t xml:space="preserve"> </w:t>
+      </w:r>
+      <w:r>
+        <w:rPr>
+          <w:rFonts w:ascii="Times New Roman" w:hAnsi="Times New Roman"/>
+          <w:color w:val="000000"/>
+          <w:sz w:val="24"/>
+          <w:szCs w:val="24"/>
+          <w:lang w:val="ru-RU"/>
+        </w:rPr>
         <w:t>–</w:t>
       </w:r>
       <w:r>
@@ -1467,7 +1049,7 @@
           <w:szCs w:val="24"/>
           <w:lang w:val="ru-RU"/>
         </w:rPr>
-        <w:t xml:space="preserve">Текст программы </w:t>
+        <w:t>Текст программы</w:t>
       </w:r>
       <w:r>
         <w:rPr>
@@ -1475,6 +1057,16 @@
           <w:color w:val="000000"/>
           <w:sz w:val="24"/>
           <w:szCs w:val="24"/>
+          <w:lang w:val="ru-RU"/>
+        </w:rPr>
+        <w:t xml:space="preserve"> </w:t>
+      </w:r>
+      <w:r>
+        <w:rPr>
+          <w:rFonts w:ascii="Times New Roman" w:hAnsi="Times New Roman"/>
+          <w:color w:val="000000"/>
+          <w:sz w:val="24"/>
+          <w:szCs w:val="24"/>
         </w:rPr>
         <w:t>task</w:t>
       </w:r>
@@ -1486,7 +1078,17 @@
           <w:szCs w:val="24"/>
           <w:lang w:val="ru-RU"/>
         </w:rPr>
-        <w:t>32.</w:t>
+        <w:t>3</w:t>
+      </w:r>
+      <w:r>
+        <w:rPr>
+          <w:rFonts w:ascii="Times New Roman" w:hAnsi="Times New Roman"/>
+          <w:color w:val="000000"/>
+          <w:sz w:val="24"/>
+          <w:szCs w:val="24"/>
+          <w:lang w:val="ru-RU"/>
+        </w:rPr>
+        <w:t>1.</w:t>
       </w:r>
       <w:proofErr w:type="spellStart"/>
       <w:r>
@@ -1518,108 +1120,7 @@
           <w:szCs w:val="24"/>
           <w:lang w:val="ru-RU"/>
         </w:rPr>
-        <w:t xml:space="preserve">В данном задании метод </w:t>
-      </w:r>
-      <w:proofErr w:type="gramStart"/>
-      <w:r>
-        <w:rPr>
-          <w:rFonts w:ascii="Times New Roman" w:hAnsi="Times New Roman" w:cs="Times New Roman"/>
-          <w:sz w:val="24"/>
-          <w:szCs w:val="24"/>
-        </w:rPr>
-        <w:t>split</w:t>
-      </w:r>
-      <w:r>
-        <w:rPr>
-          <w:rFonts w:ascii="Times New Roman" w:hAnsi="Times New Roman" w:cs="Times New Roman"/>
-          <w:sz w:val="24"/>
-          <w:szCs w:val="24"/>
-          <w:lang w:val="ru-RU"/>
-        </w:rPr>
-        <w:t>(</w:t>
-      </w:r>
-      <w:proofErr w:type="gramEnd"/>
-      <w:r>
-        <w:rPr>
-          <w:rFonts w:ascii="Times New Roman" w:hAnsi="Times New Roman" w:cs="Times New Roman"/>
-          <w:sz w:val="24"/>
-          <w:szCs w:val="24"/>
-          <w:lang w:val="ru-RU"/>
-        </w:rPr>
-        <w:t xml:space="preserve">) без аргументов автоматически удаляет внешние пробелы и разделяет ФИО по внутренним группам пробелов любой длины. Метод </w:t>
-      </w:r>
-      <w:proofErr w:type="gramStart"/>
-      <w:r>
-        <w:rPr>
-          <w:rFonts w:ascii="Times New Roman" w:hAnsi="Times New Roman" w:cs="Times New Roman"/>
-          <w:sz w:val="24"/>
-          <w:szCs w:val="24"/>
-        </w:rPr>
-        <w:t>capitalize</w:t>
-      </w:r>
-      <w:r>
-        <w:rPr>
-          <w:rFonts w:ascii="Times New Roman" w:hAnsi="Times New Roman" w:cs="Times New Roman"/>
-          <w:sz w:val="24"/>
-          <w:szCs w:val="24"/>
-          <w:lang w:val="ru-RU"/>
-        </w:rPr>
-        <w:t>(</w:t>
-      </w:r>
-      <w:proofErr w:type="gramEnd"/>
-      <w:r>
-        <w:rPr>
-          <w:rFonts w:ascii="Times New Roman" w:hAnsi="Times New Roman" w:cs="Times New Roman"/>
-          <w:sz w:val="24"/>
-          <w:szCs w:val="24"/>
-          <w:lang w:val="ru-RU"/>
-        </w:rPr>
-        <w:t xml:space="preserve">) </w:t>
-      </w:r>
-      <w:r>
-        <w:rPr>
-          <w:rFonts w:ascii="Times New Roman" w:hAnsi="Times New Roman" w:cs="Times New Roman"/>
-          <w:sz w:val="24"/>
-          <w:szCs w:val="24"/>
-          <w:lang w:val="ru-RU"/>
-        </w:rPr>
-        <w:lastRenderedPageBreak/>
-        <w:t>преобразует фамилию, а конструкция [0].</w:t>
-      </w:r>
-      <w:r>
-        <w:rPr>
-          <w:rFonts w:ascii="Times New Roman" w:hAnsi="Times New Roman" w:cs="Times New Roman"/>
-          <w:sz w:val="24"/>
-          <w:szCs w:val="24"/>
-        </w:rPr>
-        <w:t>upper</w:t>
-      </w:r>
-      <w:r>
-        <w:rPr>
-          <w:rFonts w:ascii="Times New Roman" w:hAnsi="Times New Roman" w:cs="Times New Roman"/>
-          <w:sz w:val="24"/>
-          <w:szCs w:val="24"/>
-          <w:lang w:val="ru-RU"/>
-        </w:rPr>
-        <w:t>() извлекает первый символ строки и переводит его в верхний регистр. Вывод осуществляется через форматированную F</w:t>
-      </w:r>
-      <w:r>
-        <w:rPr>
-          <w:rFonts w:ascii="Times New Roman" w:hAnsi="Times New Roman" w:cs="Times New Roman"/>
-          <w:sz w:val="24"/>
-          <w:szCs w:val="24"/>
-          <w:lang w:val="ru-RU"/>
-        </w:rPr>
-        <w:t>-</w:t>
-      </w:r>
-      <w:r>
-        <w:rPr>
-          <w:rFonts w:ascii="Times New Roman" w:hAnsi="Times New Roman" w:cs="Times New Roman"/>
-          <w:sz w:val="24"/>
-          <w:szCs w:val="24"/>
-          <w:lang w:val="ru-RU"/>
-        </w:rPr>
-        <w:t>строку.</w:t>
+        <w:t>В данном задании программа принимает от пользователя строку кода документа, разделяет ее на фиксированные сегменты с помощью механизма срезов по индексам и выводит полученные данные. Ведущие нули сохраняются благодаря обработке данных в строковом типе.</w:t>
       </w:r>
     </w:p>
     <w:p>
@@ -1643,7 +1144,7 @@
           <w:szCs w:val="26"/>
           <w:lang w:val="ru-RU"/>
         </w:rPr>
-        <w:t>1.</w:t>
+        <w:t xml:space="preserve">1.2 </w:t>
       </w:r>
       <w:r>
         <w:rPr>
@@ -1651,28 +1152,9 @@
           <w:color w:val="000000"/>
           <w:sz w:val="26"/>
           <w:szCs w:val="26"/>
-        </w:rPr>
-        <w:t>3</w:t>
-      </w:r>
-      <w:r>
-        <w:rPr>
-          <w:rFonts w:ascii="Arial" w:hAnsi="Arial" w:cs="Arial"/>
-          <w:color w:val="000000"/>
-          <w:sz w:val="26"/>
-          <w:szCs w:val="26"/>
-          <w:lang w:val="ru-RU"/>
-        </w:rPr>
-        <w:t xml:space="preserve"> </w:t>
-      </w:r>
-      <w:r>
-        <w:rPr>
-          <w:rFonts w:ascii="Arial" w:hAnsi="Arial" w:cs="Arial"/>
-          <w:color w:val="000000"/>
-          <w:sz w:val="26"/>
-          <w:szCs w:val="26"/>
-          <w:lang w:val="ru-RU"/>
-        </w:rPr>
-        <w:t>Очистка номера телефона</w:t>
+          <w:lang w:val="ru-RU"/>
+        </w:rPr>
+        <w:t>Форматирование имени</w:t>
       </w:r>
     </w:p>
     <w:p>
@@ -1682,7 +1164,6 @@
         <w:jc w:val="both"/>
         <w:rPr>
           <w:rFonts w:ascii="Times New Roman" w:hAnsi="Times New Roman" w:cs="Times New Roman"/>
-          <w:color w:val="000000"/>
           <w:sz w:val="24"/>
           <w:szCs w:val="24"/>
           <w:lang w:val="ru-RU"/>
@@ -1691,88 +1172,11 @@
       <w:r>
         <w:rPr>
           <w:rFonts w:ascii="Times New Roman" w:hAnsi="Times New Roman" w:cs="Times New Roman"/>
-          <w:color w:val="000000"/>
-          <w:sz w:val="24"/>
-          <w:szCs w:val="24"/>
-          <w:lang w:val="ru-RU"/>
-        </w:rPr>
-        <w:t>В третьем задании реализуется задача нормализации данных. Пользователь вводит номер телефона в формате +7 (</w:t>
-      </w:r>
-      <w:r>
-        <w:rPr>
-          <w:rFonts w:ascii="Times New Roman" w:hAnsi="Times New Roman" w:cs="Times New Roman"/>
-          <w:color w:val="000000"/>
-          <w:sz w:val="24"/>
-          <w:szCs w:val="24"/>
-        </w:rPr>
-        <w:t>NNN</w:t>
-      </w:r>
-      <w:r>
-        <w:rPr>
-          <w:rFonts w:ascii="Times New Roman" w:hAnsi="Times New Roman" w:cs="Times New Roman"/>
-          <w:color w:val="000000"/>
-          <w:sz w:val="24"/>
-          <w:szCs w:val="24"/>
-          <w:lang w:val="ru-RU"/>
-        </w:rPr>
-        <w:t xml:space="preserve">) </w:t>
-      </w:r>
-      <w:r>
-        <w:rPr>
-          <w:rFonts w:ascii="Times New Roman" w:hAnsi="Times New Roman" w:cs="Times New Roman"/>
-          <w:color w:val="000000"/>
-          <w:sz w:val="24"/>
-          <w:szCs w:val="24"/>
-        </w:rPr>
-        <w:t>NNN</w:t>
-      </w:r>
-      <w:r>
-        <w:rPr>
-          <w:rFonts w:ascii="Times New Roman" w:hAnsi="Times New Roman" w:cs="Times New Roman"/>
-          <w:color w:val="000000"/>
-          <w:sz w:val="24"/>
-          <w:szCs w:val="24"/>
-          <w:lang w:val="ru-RU"/>
-        </w:rPr>
-        <w:t>-</w:t>
-      </w:r>
-      <w:r>
-        <w:rPr>
-          <w:rFonts w:ascii="Times New Roman" w:hAnsi="Times New Roman" w:cs="Times New Roman"/>
-          <w:color w:val="000000"/>
-          <w:sz w:val="24"/>
-          <w:szCs w:val="24"/>
-        </w:rPr>
-        <w:t>NN</w:t>
-      </w:r>
-      <w:r>
-        <w:rPr>
-          <w:rFonts w:ascii="Times New Roman" w:hAnsi="Times New Roman" w:cs="Times New Roman"/>
-          <w:color w:val="000000"/>
-          <w:sz w:val="24"/>
-          <w:szCs w:val="24"/>
-          <w:lang w:val="ru-RU"/>
-        </w:rPr>
-        <w:t>-</w:t>
-      </w:r>
-      <w:r>
-        <w:rPr>
-          <w:rFonts w:ascii="Times New Roman" w:hAnsi="Times New Roman" w:cs="Times New Roman"/>
-          <w:color w:val="000000"/>
-          <w:sz w:val="24"/>
-          <w:szCs w:val="24"/>
-        </w:rPr>
-        <w:t>NN</w:t>
-      </w:r>
-      <w:r>
-        <w:rPr>
-          <w:rFonts w:ascii="Times New Roman" w:hAnsi="Times New Roman" w:cs="Times New Roman"/>
-          <w:color w:val="000000"/>
-          <w:sz w:val="24"/>
-          <w:szCs w:val="24"/>
-          <w:lang w:val="ru-RU"/>
-        </w:rPr>
-        <w:t>. Программа должна последовательно удалить все нецифровые символы: плюс, круглые скобки, дефисы и пробелы, вернув сплошную строку из цифр.</w:t>
+          <w:sz w:val="24"/>
+          <w:szCs w:val="24"/>
+          <w:lang w:val="ru-RU"/>
+        </w:rPr>
+        <w:t>Во втором задании пользователь вводит фамилию, имя и отчество одной строкой с произвольным регистром букв и переменным количеством пробелов. Программа должна выполнить очистку строки, сделать первую букву фамилии заглавной, а остальные строчными, после чего извлечь заглавные инициалы имени и отчества с точками.</w:t>
       </w:r>
     </w:p>
     <w:p>
@@ -1794,7 +1198,7 @@
           <w:szCs w:val="24"/>
           <w:lang w:val="ru-RU"/>
         </w:rPr>
-        <w:t xml:space="preserve">Алгоритм решения задания представлен на рисунке </w:t>
+        <w:t xml:space="preserve">Алгоритм решения задания </w:t>
       </w:r>
       <w:r>
         <w:rPr>
@@ -1803,16 +1207,7 @@
           <w:szCs w:val="24"/>
           <w:lang w:val="ru-RU"/>
         </w:rPr>
-        <w:t>5</w:t>
-      </w:r>
-      <w:r>
-        <w:rPr>
-          <w:rFonts w:ascii="Times New Roman" w:hAnsi="Times New Roman" w:cs="Times New Roman"/>
-          <w:sz w:val="24"/>
-          <w:szCs w:val="24"/>
-          <w:lang w:val="ru-RU"/>
-        </w:rPr>
-        <w:t>.</w:t>
+        <w:t>представлен на рисунке 3.</w:t>
       </w:r>
     </w:p>
     <w:p>
@@ -1822,7 +1217,6 @@
         <w:jc w:val="center"/>
         <w:rPr>
           <w:rFonts w:ascii="Times New Roman" w:hAnsi="Times New Roman" w:cs="Times New Roman"/>
-          <w:color w:val="000000"/>
           <w:sz w:val="24"/>
           <w:szCs w:val="24"/>
           <w:lang w:val="ru-RU"/>
@@ -1832,16 +1226,16 @@
         <w:rPr>
           <w:rFonts w:ascii="Times New Roman" w:hAnsi="Times New Roman" w:cs="Times New Roman"/>
           <w:noProof/>
-          <w:color w:val="000000"/>
-          <w:sz w:val="24"/>
-          <w:szCs w:val="24"/>
-          <w:lang w:val="ru-RU"/>
-        </w:rPr>
+          <w:sz w:val="24"/>
+          <w:szCs w:val="24"/>
+          <w:lang w:val="ru-RU"/>
+        </w:rPr>
+        <w:lastRenderedPageBreak/>
         <w:drawing>
-          <wp:inline distT="0" distB="0" distL="0" distR="0" wp14:anchorId="61A27C37" wp14:editId="3827E0E4">
-            <wp:extent cx="3105150" cy="4972050"/>
+          <wp:inline distT="0" distB="0" distL="0" distR="0" wp14:anchorId="2BC6E1C6" wp14:editId="5B847267">
+            <wp:extent cx="2400300" cy="4876800"/>
             <wp:effectExtent l="0" t="0" r="0" b="0"/>
-            <wp:docPr id="8" name="Рисунок 8"/>
+            <wp:docPr id="6" name="Рисунок 6"/>
             <wp:cNvGraphicFramePr>
               <a:graphicFrameLocks xmlns:a="http://schemas.openxmlformats.org/drawingml/2006/main" noChangeAspect="1"/>
             </wp:cNvGraphicFramePr>
@@ -1849,7 +1243,7 @@
               <a:graphicData uri="http://schemas.openxmlformats.org/drawingml/2006/picture">
                 <pic:pic xmlns:pic="http://schemas.openxmlformats.org/drawingml/2006/picture">
                   <pic:nvPicPr>
-                    <pic:cNvPr id="8" name="Рисунок 8"/>
+                    <pic:cNvPr id="6" name="Рисунок 6"/>
                     <pic:cNvPicPr/>
                   </pic:nvPicPr>
                   <pic:blipFill>
@@ -1861,7 +1255,7 @@
                   <pic:spPr>
                     <a:xfrm>
                       <a:off x="0" y="0"/>
-                      <a:ext cx="3105150" cy="4972050"/>
+                      <a:ext cx="2400300" cy="4876800"/>
                     </a:xfrm>
                     <a:prstGeom prst="rect">
                       <a:avLst/>
@@ -1876,47 +1270,55 @@
     </w:p>
     <w:p>
       <w:pPr>
-        <w:spacing w:after="80" w:line="360" w:lineRule="auto"/>
-        <w:ind w:firstLine="709"/>
-        <w:jc w:val="both"/>
-        <w:rPr>
-          <w:rFonts w:ascii="Times New Roman" w:hAnsi="Times New Roman" w:cs="Times New Roman"/>
-          <w:color w:val="000000"/>
-          <w:sz w:val="24"/>
-          <w:szCs w:val="24"/>
-          <w:lang w:val="ru-RU"/>
-        </w:rPr>
-      </w:pPr>
-    </w:p>
-    <w:p>
-      <w:pPr>
         <w:spacing w:before="80" w:after="120" w:line="360" w:lineRule="auto"/>
         <w:ind w:firstLine="709"/>
         <w:jc w:val="center"/>
         <w:rPr>
-          <w:rFonts w:ascii="Times New Roman" w:hAnsi="Times New Roman" w:cs="Times New Roman"/>
-          <w:sz w:val="24"/>
-          <w:szCs w:val="24"/>
-          <w:lang w:val="ru-RU"/>
-        </w:rPr>
-      </w:pPr>
-      <w:r>
-        <w:rPr>
-          <w:rFonts w:ascii="Times New Roman" w:hAnsi="Times New Roman" w:cs="Times New Roman"/>
-          <w:sz w:val="24"/>
-          <w:szCs w:val="24"/>
-          <w:lang w:val="ru-RU"/>
-        </w:rPr>
-        <w:t xml:space="preserve">Рисунок 5 </w:t>
-      </w:r>
-      <w:r>
-        <w:rPr>
           <w:rFonts w:ascii="Times New Roman" w:hAnsi="Times New Roman"/>
           <w:color w:val="000000"/>
           <w:sz w:val="24"/>
           <w:szCs w:val="24"/>
           <w:lang w:val="ru-RU"/>
         </w:rPr>
+      </w:pPr>
+      <w:r>
+        <w:rPr>
+          <w:rFonts w:ascii="Times New Roman" w:hAnsi="Times New Roman"/>
+          <w:color w:val="000000"/>
+          <w:sz w:val="24"/>
+          <w:szCs w:val="24"/>
+          <w:lang w:val="ru-RU"/>
+        </w:rPr>
+        <w:t xml:space="preserve">Рисунок </w:t>
+      </w:r>
+      <w:r>
+        <w:rPr>
+          <w:rFonts w:ascii="Times New Roman" w:hAnsi="Times New Roman"/>
+          <w:color w:val="000000"/>
+          <w:sz w:val="24"/>
+          <w:szCs w:val="24"/>
+          <w:lang w:val="ru-RU"/>
+        </w:rPr>
+        <w:t>3</w:t>
+      </w:r>
+      <w:r>
+        <w:rPr>
+          <w:rFonts w:ascii="Times New Roman" w:hAnsi="Times New Roman"/>
+          <w:color w:val="000000"/>
+          <w:sz w:val="24"/>
+          <w:szCs w:val="24"/>
+          <w:lang w:val="ru-RU"/>
+        </w:rPr>
+        <w:t xml:space="preserve"> </w:t>
+      </w:r>
+      <w:r>
+        <w:rPr>
+          <w:rFonts w:ascii="Times New Roman" w:hAnsi="Times New Roman"/>
+          <w:color w:val="000000"/>
+          <w:sz w:val="24"/>
+          <w:szCs w:val="24"/>
+          <w:lang w:val="ru-RU"/>
+        </w:rPr>
         <w:t>–</w:t>
       </w:r>
       <w:r>
@@ -1927,7 +1329,17 @@
           <w:szCs w:val="24"/>
           <w:lang w:val="ru-RU"/>
         </w:rPr>
-        <w:t xml:space="preserve"> Блок-схема программы</w:t>
+        <w:t xml:space="preserve"> </w:t>
+      </w:r>
+      <w:r>
+        <w:rPr>
+          <w:rFonts w:ascii="Times New Roman" w:hAnsi="Times New Roman"/>
+          <w:color w:val="000000"/>
+          <w:sz w:val="24"/>
+          <w:szCs w:val="24"/>
+          <w:lang w:val="ru-RU"/>
+        </w:rPr>
+        <w:t>Блок-схема программы</w:t>
       </w:r>
     </w:p>
     <w:p>
@@ -1936,47 +1348,45 @@
         <w:ind w:firstLine="709"/>
         <w:jc w:val="both"/>
         <w:rPr>
-          <w:rFonts w:ascii="Times New Roman" w:hAnsi="Times New Roman" w:cs="Times New Roman"/>
-          <w:sz w:val="24"/>
-          <w:szCs w:val="24"/>
-          <w:lang w:val="ru-RU"/>
-        </w:rPr>
-      </w:pPr>
-      <w:r>
-        <w:rPr>
-          <w:rFonts w:ascii="Times New Roman" w:hAnsi="Times New Roman" w:cs="Times New Roman"/>
-          <w:sz w:val="24"/>
-          <w:szCs w:val="24"/>
-          <w:lang w:val="ru-RU"/>
-        </w:rPr>
-        <w:t>Текст программы представлен на рисунке 6.</w:t>
+          <w:rFonts w:ascii="Times New Roman" w:hAnsi="Times New Roman"/>
+          <w:color w:val="000000"/>
+          <w:sz w:val="24"/>
+          <w:szCs w:val="24"/>
+          <w:lang w:val="ru-RU"/>
+        </w:rPr>
+      </w:pPr>
+      <w:r>
+        <w:rPr>
+          <w:rFonts w:ascii="Times New Roman" w:hAnsi="Times New Roman"/>
+          <w:color w:val="000000"/>
+          <w:sz w:val="24"/>
+          <w:szCs w:val="24"/>
+          <w:lang w:val="ru-RU"/>
+        </w:rPr>
+        <w:t>Текст программы представлен на рисунке 4.</w:t>
       </w:r>
     </w:p>
     <w:p>
       <w:pPr>
         <w:spacing w:before="80" w:after="120" w:line="360" w:lineRule="auto"/>
         <w:ind w:firstLine="709"/>
-        <w:jc w:val="center"/>
-        <w:rPr>
-          <w:rFonts w:ascii="Times New Roman" w:hAnsi="Times New Roman" w:cs="Times New Roman"/>
-          <w:sz w:val="24"/>
-          <w:szCs w:val="24"/>
-          <w:lang w:val="ru-RU"/>
-        </w:rPr>
-      </w:pPr>
-      <w:r>
-        <w:rPr>
-          <w:rFonts w:ascii="Times New Roman" w:hAnsi="Times New Roman" w:cs="Times New Roman"/>
-          <w:sz w:val="24"/>
-          <w:szCs w:val="24"/>
-          <w:lang w:val="ru-RU"/>
-        </w:rPr>
-        <w:lastRenderedPageBreak/>
+        <w:rPr>
+          <w:sz w:val="24"/>
+          <w:szCs w:val="24"/>
+          <w:lang w:val="ru-RU"/>
+        </w:rPr>
+      </w:pPr>
+      <w:r>
+        <w:rPr>
+          <w:sz w:val="24"/>
+          <w:szCs w:val="24"/>
+          <w:lang w:val="ru-RU"/>
+        </w:rPr>
         <w:drawing>
-          <wp:inline distT="0" distB="0" distL="0" distR="0" wp14:anchorId="3F1FA3EF" wp14:editId="3BE0CDCF">
-            <wp:extent cx="5134692" cy="2324424"/>
-            <wp:effectExtent l="0" t="0" r="8890" b="0"/>
-            <wp:docPr id="9" name="Рисунок 9"/>
+          <wp:inline distT="0" distB="0" distL="0" distR="0" wp14:anchorId="74790F1B" wp14:editId="71852235">
+            <wp:extent cx="5518298" cy="1850390"/>
+            <wp:effectExtent l="0" t="0" r="6350" b="0"/>
+            <wp:docPr id="7" name="Рисунок 7"/>
             <wp:cNvGraphicFramePr>
               <a:graphicFrameLocks xmlns:a="http://schemas.openxmlformats.org/drawingml/2006/main" noChangeAspect="1"/>
             </wp:cNvGraphicFramePr>
@@ -1996,7 +1406,7 @@
                   <pic:spPr>
                     <a:xfrm>
                       <a:off x="0" y="0"/>
-                      <a:ext cx="5134692" cy="2324424"/>
+                      <a:ext cx="5522317" cy="1851738"/>
                     </a:xfrm>
                     <a:prstGeom prst="rect">
                       <a:avLst/>
@@ -2011,63 +1421,408 @@
     </w:p>
     <w:p>
       <w:pPr>
+        <w:spacing w:before="80" w:after="120" w:line="360" w:lineRule="auto"/>
+        <w:ind w:firstLine="709"/>
+        <w:jc w:val="center"/>
+        <w:rPr>
+          <w:rFonts w:ascii="Times New Roman" w:hAnsi="Times New Roman"/>
+          <w:color w:val="000000"/>
+          <w:sz w:val="24"/>
+          <w:szCs w:val="24"/>
+        </w:rPr>
+      </w:pPr>
+      <w:r>
+        <w:rPr>
+          <w:sz w:val="24"/>
+          <w:szCs w:val="24"/>
+          <w:lang w:val="ru-RU"/>
+        </w:rPr>
+        <w:t xml:space="preserve">Рисунок 4 </w:t>
+      </w:r>
+      <w:r>
+        <w:rPr>
+          <w:rFonts w:ascii="Times New Roman" w:hAnsi="Times New Roman"/>
+          <w:color w:val="000000"/>
+          <w:sz w:val="24"/>
+          <w:szCs w:val="24"/>
+          <w:lang w:val="ru-RU"/>
+        </w:rPr>
+        <w:t>–</w:t>
+      </w:r>
+      <w:r>
+        <w:rPr>
+          <w:rFonts w:ascii="Times New Roman" w:hAnsi="Times New Roman"/>
+          <w:color w:val="000000"/>
+          <w:sz w:val="24"/>
+          <w:szCs w:val="24"/>
+          <w:lang w:val="ru-RU"/>
+        </w:rPr>
+        <w:t xml:space="preserve"> </w:t>
+      </w:r>
+      <w:r>
+        <w:rPr>
+          <w:rFonts w:ascii="Times New Roman" w:hAnsi="Times New Roman"/>
+          <w:color w:val="000000"/>
+          <w:sz w:val="24"/>
+          <w:szCs w:val="24"/>
+          <w:lang w:val="ru-RU"/>
+        </w:rPr>
+        <w:t xml:space="preserve">Текст программы </w:t>
+      </w:r>
+      <w:r>
+        <w:rPr>
+          <w:rFonts w:ascii="Times New Roman" w:hAnsi="Times New Roman"/>
+          <w:color w:val="000000"/>
+          <w:sz w:val="24"/>
+          <w:szCs w:val="24"/>
+        </w:rPr>
+        <w:t>task</w:t>
+      </w:r>
+      <w:r>
+        <w:rPr>
+          <w:rFonts w:ascii="Times New Roman" w:hAnsi="Times New Roman"/>
+          <w:color w:val="000000"/>
+          <w:sz w:val="24"/>
+          <w:szCs w:val="24"/>
+          <w:lang w:val="ru-RU"/>
+        </w:rPr>
+        <w:t>32.</w:t>
+      </w:r>
+      <w:proofErr w:type="spellStart"/>
+      <w:r>
+        <w:rPr>
+          <w:rFonts w:ascii="Times New Roman" w:hAnsi="Times New Roman"/>
+          <w:color w:val="000000"/>
+          <w:sz w:val="24"/>
+          <w:szCs w:val="24"/>
+        </w:rPr>
+        <w:t>py</w:t>
+      </w:r>
+      <w:proofErr w:type="spellEnd"/>
+    </w:p>
+    <w:p>
+      <w:pPr>
+        <w:spacing w:after="0" w:line="360" w:lineRule="auto"/>
+        <w:ind w:firstLine="709"/>
+        <w:jc w:val="both"/>
+        <w:rPr>
+          <w:rFonts w:ascii="Times New Roman" w:hAnsi="Times New Roman" w:cs="Times New Roman"/>
+          <w:sz w:val="24"/>
+          <w:szCs w:val="24"/>
+        </w:rPr>
+      </w:pPr>
+      <w:r>
+        <w:rPr>
+          <w:rFonts w:ascii="Times New Roman" w:hAnsi="Times New Roman" w:cs="Times New Roman"/>
+          <w:sz w:val="24"/>
+          <w:szCs w:val="24"/>
+          <w:lang w:val="ru-RU"/>
+        </w:rPr>
+        <w:t xml:space="preserve">В данном задании метод </w:t>
+      </w:r>
+      <w:proofErr w:type="gramStart"/>
+      <w:r>
+        <w:rPr>
+          <w:rFonts w:ascii="Times New Roman" w:hAnsi="Times New Roman" w:cs="Times New Roman"/>
+          <w:sz w:val="24"/>
+          <w:szCs w:val="24"/>
+        </w:rPr>
+        <w:t>split</w:t>
+      </w:r>
+      <w:r>
+        <w:rPr>
+          <w:rFonts w:ascii="Times New Roman" w:hAnsi="Times New Roman" w:cs="Times New Roman"/>
+          <w:sz w:val="24"/>
+          <w:szCs w:val="24"/>
+          <w:lang w:val="ru-RU"/>
+        </w:rPr>
+        <w:t>(</w:t>
+      </w:r>
+      <w:proofErr w:type="gramEnd"/>
+      <w:r>
+        <w:rPr>
+          <w:rFonts w:ascii="Times New Roman" w:hAnsi="Times New Roman" w:cs="Times New Roman"/>
+          <w:sz w:val="24"/>
+          <w:szCs w:val="24"/>
+          <w:lang w:val="ru-RU"/>
+        </w:rPr>
+        <w:t xml:space="preserve">) без аргументов автоматически удаляет внешние пробелы и разделяет ФИО по внутренним группам пробелов любой длины. Метод </w:t>
+      </w:r>
+      <w:proofErr w:type="gramStart"/>
+      <w:r>
+        <w:rPr>
+          <w:rFonts w:ascii="Times New Roman" w:hAnsi="Times New Roman" w:cs="Times New Roman"/>
+          <w:sz w:val="24"/>
+          <w:szCs w:val="24"/>
+        </w:rPr>
+        <w:t>capitalize</w:t>
+      </w:r>
+      <w:r>
+        <w:rPr>
+          <w:rFonts w:ascii="Times New Roman" w:hAnsi="Times New Roman" w:cs="Times New Roman"/>
+          <w:sz w:val="24"/>
+          <w:szCs w:val="24"/>
+          <w:lang w:val="ru-RU"/>
+        </w:rPr>
+        <w:t>(</w:t>
+      </w:r>
+      <w:proofErr w:type="gramEnd"/>
+      <w:r>
+        <w:rPr>
+          <w:rFonts w:ascii="Times New Roman" w:hAnsi="Times New Roman" w:cs="Times New Roman"/>
+          <w:sz w:val="24"/>
+          <w:szCs w:val="24"/>
+          <w:lang w:val="ru-RU"/>
+        </w:rPr>
+        <w:t xml:space="preserve">) </w:t>
+      </w:r>
+      <w:r>
+        <w:rPr>
+          <w:rFonts w:ascii="Times New Roman" w:hAnsi="Times New Roman" w:cs="Times New Roman"/>
+          <w:sz w:val="24"/>
+          <w:szCs w:val="24"/>
+          <w:lang w:val="ru-RU"/>
+        </w:rPr>
+        <w:lastRenderedPageBreak/>
+        <w:t>преобразует фамилию, а конструкция [0].</w:t>
+      </w:r>
+      <w:r>
+        <w:rPr>
+          <w:rFonts w:ascii="Times New Roman" w:hAnsi="Times New Roman" w:cs="Times New Roman"/>
+          <w:sz w:val="24"/>
+          <w:szCs w:val="24"/>
+        </w:rPr>
+        <w:t>upper</w:t>
+      </w:r>
+      <w:r>
+        <w:rPr>
+          <w:rFonts w:ascii="Times New Roman" w:hAnsi="Times New Roman" w:cs="Times New Roman"/>
+          <w:sz w:val="24"/>
+          <w:szCs w:val="24"/>
+          <w:lang w:val="ru-RU"/>
+        </w:rPr>
+        <w:t>() извлекает первый символ строки и переводит его в верхний регистр. Вывод осуществляется через форматированную F</w:t>
+      </w:r>
+      <w:r>
+        <w:rPr>
+          <w:rFonts w:ascii="Times New Roman" w:hAnsi="Times New Roman" w:cs="Times New Roman"/>
+          <w:sz w:val="24"/>
+          <w:szCs w:val="24"/>
+          <w:lang w:val="ru-RU"/>
+        </w:rPr>
+        <w:t>-</w:t>
+      </w:r>
+      <w:r>
+        <w:rPr>
+          <w:rFonts w:ascii="Times New Roman" w:hAnsi="Times New Roman" w:cs="Times New Roman"/>
+          <w:sz w:val="24"/>
+          <w:szCs w:val="24"/>
+          <w:lang w:val="ru-RU"/>
+        </w:rPr>
+        <w:t>строку.</w:t>
+      </w:r>
+    </w:p>
+    <w:p>
+      <w:pPr>
+        <w:spacing w:before="240" w:after="120" w:line="240" w:lineRule="auto"/>
+        <w:ind w:firstLine="709"/>
+        <w:jc w:val="both"/>
+        <w:rPr>
+          <w:rFonts w:ascii="Arial" w:hAnsi="Arial" w:cs="Arial"/>
+          <w:color w:val="000000"/>
+          <w:sz w:val="26"/>
+          <w:szCs w:val="26"/>
+          <w:lang w:val="ru-RU"/>
+        </w:rPr>
+      </w:pPr>
+      <w:r>
+        <w:rPr>
+          <w:rFonts w:ascii="Arial" w:hAnsi="Arial" w:cs="Arial"/>
+          <w:color w:val="000000"/>
+          <w:sz w:val="26"/>
+          <w:szCs w:val="26"/>
+          <w:lang w:val="ru-RU"/>
+        </w:rPr>
+        <w:t>1.</w:t>
+      </w:r>
+      <w:r>
+        <w:rPr>
+          <w:rFonts w:ascii="Arial" w:hAnsi="Arial" w:cs="Arial"/>
+          <w:color w:val="000000"/>
+          <w:sz w:val="26"/>
+          <w:szCs w:val="26"/>
+        </w:rPr>
+        <w:t>3</w:t>
+      </w:r>
+      <w:r>
+        <w:rPr>
+          <w:rFonts w:ascii="Arial" w:hAnsi="Arial" w:cs="Arial"/>
+          <w:color w:val="000000"/>
+          <w:sz w:val="26"/>
+          <w:szCs w:val="26"/>
+          <w:lang w:val="ru-RU"/>
+        </w:rPr>
+        <w:t xml:space="preserve"> </w:t>
+      </w:r>
+      <w:r>
+        <w:rPr>
+          <w:rFonts w:ascii="Arial" w:hAnsi="Arial" w:cs="Arial"/>
+          <w:color w:val="000000"/>
+          <w:sz w:val="26"/>
+          <w:szCs w:val="26"/>
+          <w:lang w:val="ru-RU"/>
+        </w:rPr>
+        <w:t>Очистка номера телефона</w:t>
+      </w:r>
+    </w:p>
+    <w:p>
+      <w:pPr>
+        <w:spacing w:after="0" w:line="360" w:lineRule="auto"/>
+        <w:ind w:firstLine="709"/>
+        <w:jc w:val="both"/>
+        <w:rPr>
+          <w:rFonts w:ascii="Times New Roman" w:hAnsi="Times New Roman" w:cs="Times New Roman"/>
+          <w:color w:val="000000"/>
+          <w:sz w:val="24"/>
+          <w:szCs w:val="24"/>
+          <w:lang w:val="ru-RU"/>
+        </w:rPr>
+      </w:pPr>
+      <w:r>
+        <w:rPr>
+          <w:rFonts w:ascii="Times New Roman" w:hAnsi="Times New Roman" w:cs="Times New Roman"/>
+          <w:color w:val="000000"/>
+          <w:sz w:val="24"/>
+          <w:szCs w:val="24"/>
+          <w:lang w:val="ru-RU"/>
+        </w:rPr>
+        <w:t>В третьем задании реализуется задача нормализации данных. Пользователь вводит номер телефона в формате +7 (</w:t>
+      </w:r>
+      <w:r>
+        <w:rPr>
+          <w:rFonts w:ascii="Times New Roman" w:hAnsi="Times New Roman" w:cs="Times New Roman"/>
+          <w:color w:val="000000"/>
+          <w:sz w:val="24"/>
+          <w:szCs w:val="24"/>
+        </w:rPr>
+        <w:t>NNN</w:t>
+      </w:r>
+      <w:r>
+        <w:rPr>
+          <w:rFonts w:ascii="Times New Roman" w:hAnsi="Times New Roman" w:cs="Times New Roman"/>
+          <w:color w:val="000000"/>
+          <w:sz w:val="24"/>
+          <w:szCs w:val="24"/>
+          <w:lang w:val="ru-RU"/>
+        </w:rPr>
+        <w:t xml:space="preserve">) </w:t>
+      </w:r>
+      <w:r>
+        <w:rPr>
+          <w:rFonts w:ascii="Times New Roman" w:hAnsi="Times New Roman" w:cs="Times New Roman"/>
+          <w:color w:val="000000"/>
+          <w:sz w:val="24"/>
+          <w:szCs w:val="24"/>
+        </w:rPr>
+        <w:t>NNN</w:t>
+      </w:r>
+      <w:r>
+        <w:rPr>
+          <w:rFonts w:ascii="Times New Roman" w:hAnsi="Times New Roman" w:cs="Times New Roman"/>
+          <w:color w:val="000000"/>
+          <w:sz w:val="24"/>
+          <w:szCs w:val="24"/>
+          <w:lang w:val="ru-RU"/>
+        </w:rPr>
+        <w:t>-</w:t>
+      </w:r>
+      <w:r>
+        <w:rPr>
+          <w:rFonts w:ascii="Times New Roman" w:hAnsi="Times New Roman" w:cs="Times New Roman"/>
+          <w:color w:val="000000"/>
+          <w:sz w:val="24"/>
+          <w:szCs w:val="24"/>
+        </w:rPr>
+        <w:t>NN</w:t>
+      </w:r>
+      <w:r>
+        <w:rPr>
+          <w:rFonts w:ascii="Times New Roman" w:hAnsi="Times New Roman" w:cs="Times New Roman"/>
+          <w:color w:val="000000"/>
+          <w:sz w:val="24"/>
+          <w:szCs w:val="24"/>
+          <w:lang w:val="ru-RU"/>
+        </w:rPr>
+        <w:t>-</w:t>
+      </w:r>
+      <w:r>
+        <w:rPr>
+          <w:rFonts w:ascii="Times New Roman" w:hAnsi="Times New Roman" w:cs="Times New Roman"/>
+          <w:color w:val="000000"/>
+          <w:sz w:val="24"/>
+          <w:szCs w:val="24"/>
+        </w:rPr>
+        <w:t>NN</w:t>
+      </w:r>
+      <w:r>
+        <w:rPr>
+          <w:rFonts w:ascii="Times New Roman" w:hAnsi="Times New Roman" w:cs="Times New Roman"/>
+          <w:color w:val="000000"/>
+          <w:sz w:val="24"/>
+          <w:szCs w:val="24"/>
+          <w:lang w:val="ru-RU"/>
+        </w:rPr>
+        <w:t>. Программа должна последовательно удалить все нецифровые символы: плюс, круглые скобки, дефисы и пробелы, вернув сплошную строку из цифр.</w:t>
+      </w:r>
+    </w:p>
+    <w:p>
+      <w:pPr>
+        <w:spacing w:after="0" w:line="360" w:lineRule="auto"/>
+        <w:ind w:firstLine="709"/>
+        <w:jc w:val="both"/>
+        <w:rPr>
+          <w:rFonts w:ascii="Times New Roman" w:hAnsi="Times New Roman" w:cs="Times New Roman"/>
+          <w:sz w:val="24"/>
+          <w:szCs w:val="24"/>
+          <w:lang w:val="ru-RU"/>
+        </w:rPr>
+      </w:pPr>
+      <w:r>
+        <w:rPr>
+          <w:rFonts w:ascii="Times New Roman" w:hAnsi="Times New Roman" w:cs="Times New Roman"/>
+          <w:sz w:val="24"/>
+          <w:szCs w:val="24"/>
+          <w:lang w:val="ru-RU"/>
+        </w:rPr>
+        <w:t xml:space="preserve">Алгоритм решения задания представлен на рисунке </w:t>
+      </w:r>
+      <w:r>
+        <w:rPr>
+          <w:rFonts w:ascii="Times New Roman" w:hAnsi="Times New Roman" w:cs="Times New Roman"/>
+          <w:sz w:val="24"/>
+          <w:szCs w:val="24"/>
+          <w:lang w:val="ru-RU"/>
+        </w:rPr>
+        <w:t>5</w:t>
+      </w:r>
+      <w:r>
+        <w:rPr>
+          <w:rFonts w:ascii="Times New Roman" w:hAnsi="Times New Roman" w:cs="Times New Roman"/>
+          <w:sz w:val="24"/>
+          <w:szCs w:val="24"/>
+          <w:lang w:val="ru-RU"/>
+        </w:rPr>
+        <w:t>.</w:t>
+      </w:r>
+    </w:p>
+    <w:p>
+      <w:pPr>
         <w:spacing w:after="80" w:line="360" w:lineRule="auto"/>
         <w:ind w:firstLine="709"/>
         <w:jc w:val="center"/>
         <w:rPr>
-          <w:rFonts w:ascii="Times New Roman" w:hAnsi="Times New Roman"/>
-          <w:color w:val="000000"/>
-          <w:sz w:val="24"/>
-          <w:szCs w:val="24"/>
-        </w:rPr>
-      </w:pPr>
-      <w:r>
-        <w:rPr>
-          <w:rFonts w:ascii="Times New Roman" w:hAnsi="Times New Roman"/>
-          <w:color w:val="000000"/>
-          <w:sz w:val="24"/>
-          <w:szCs w:val="24"/>
-          <w:lang w:val="ru-RU"/>
-        </w:rPr>
-        <w:t xml:space="preserve">Рисунок 6 </w:t>
-      </w:r>
-      <w:r>
-        <w:rPr>
-          <w:rFonts w:ascii="Times New Roman" w:hAnsi="Times New Roman"/>
-          <w:color w:val="000000"/>
-          <w:sz w:val="24"/>
-          <w:szCs w:val="24"/>
-          <w:lang w:val="ru-RU"/>
-        </w:rPr>
-        <w:t>–</w:t>
-      </w:r>
-      <w:r>
-        <w:rPr>
-          <w:rFonts w:ascii="Times New Roman" w:hAnsi="Times New Roman"/>
-          <w:color w:val="000000"/>
-          <w:sz w:val="24"/>
-          <w:szCs w:val="24"/>
-          <w:lang w:val="ru-RU"/>
-        </w:rPr>
-        <w:t xml:space="preserve"> Текст программы </w:t>
-      </w:r>
-      <w:r>
-        <w:rPr>
-          <w:rFonts w:ascii="Times New Roman" w:hAnsi="Times New Roman"/>
-          <w:color w:val="000000"/>
-          <w:sz w:val="24"/>
-          <w:szCs w:val="24"/>
-        </w:rPr>
-        <w:t>task33.py</w:t>
-      </w:r>
-    </w:p>
-    <w:p>
-      <w:pPr>
-        <w:spacing w:after="0" w:line="360" w:lineRule="auto"/>
-        <w:ind w:firstLine="709"/>
-        <w:jc w:val="both"/>
-        <w:rPr>
           <w:rFonts w:ascii="Times New Roman" w:hAnsi="Times New Roman" w:cs="Times New Roman"/>
+          <w:color w:val="000000"/>
           <w:sz w:val="24"/>
           <w:szCs w:val="24"/>
           <w:lang w:val="ru-RU"/>
@@ -2076,156 +1831,17 @@
       <w:r>
         <w:rPr>
           <w:rFonts w:ascii="Times New Roman" w:hAnsi="Times New Roman" w:cs="Times New Roman"/>
-          <w:sz w:val="24"/>
-          <w:szCs w:val="24"/>
-          <w:lang w:val="ru-RU"/>
-        </w:rPr>
-        <w:t xml:space="preserve">В данном задании очистка строки от нежелательных артефактов ввода выполняется за счет каскадного вызова встроенного строкового метода </w:t>
-      </w:r>
-      <w:proofErr w:type="gramStart"/>
-      <w:r>
-        <w:rPr>
-          <w:rFonts w:ascii="Times New Roman" w:hAnsi="Times New Roman" w:cs="Times New Roman"/>
-          <w:sz w:val="24"/>
-          <w:szCs w:val="24"/>
-        </w:rPr>
-        <w:t>replace</w:t>
-      </w:r>
-      <w:r>
-        <w:rPr>
-          <w:rFonts w:ascii="Times New Roman" w:hAnsi="Times New Roman" w:cs="Times New Roman"/>
-          <w:sz w:val="24"/>
-          <w:szCs w:val="24"/>
-          <w:lang w:val="ru-RU"/>
-        </w:rPr>
-        <w:t>(</w:t>
-      </w:r>
-      <w:proofErr w:type="gramEnd"/>
-      <w:r>
-        <w:rPr>
-          <w:rFonts w:ascii="Times New Roman" w:hAnsi="Times New Roman" w:cs="Times New Roman"/>
-          <w:sz w:val="24"/>
-          <w:szCs w:val="24"/>
-          <w:lang w:val="ru-RU"/>
-        </w:rPr>
-        <w:t>), который заменяет заданные символы на пустые строки "", эффективно удаляя их из итогового результата.</w:t>
-      </w:r>
-    </w:p>
-    <w:p>
-      <w:pPr>
-        <w:spacing w:before="240" w:after="120" w:line="240" w:lineRule="auto"/>
-        <w:ind w:firstLine="709"/>
-        <w:jc w:val="both"/>
-        <w:rPr>
-          <w:rFonts w:ascii="Arial" w:hAnsi="Arial" w:cs="Arial"/>
-          <w:color w:val="000000"/>
-          <w:sz w:val="26"/>
-          <w:szCs w:val="26"/>
-          <w:lang w:val="ru-RU"/>
-        </w:rPr>
-      </w:pPr>
-      <w:r>
-        <w:rPr>
-          <w:rFonts w:ascii="Arial" w:hAnsi="Arial" w:cs="Arial"/>
-          <w:color w:val="000000"/>
-          <w:sz w:val="26"/>
-          <w:szCs w:val="26"/>
-          <w:lang w:val="ru-RU"/>
-        </w:rPr>
-        <w:t>1.</w:t>
-      </w:r>
-      <w:r>
-        <w:rPr>
-          <w:rFonts w:ascii="Arial" w:hAnsi="Arial" w:cs="Arial"/>
-          <w:color w:val="000000"/>
-          <w:sz w:val="26"/>
-          <w:szCs w:val="26"/>
-        </w:rPr>
-        <w:t xml:space="preserve">4 </w:t>
-      </w:r>
-      <w:r>
-        <w:rPr>
-          <w:rFonts w:ascii="Arial" w:hAnsi="Arial" w:cs="Arial"/>
-          <w:color w:val="000000"/>
-          <w:sz w:val="26"/>
-          <w:szCs w:val="26"/>
-          <w:lang w:val="ru-RU"/>
-        </w:rPr>
-        <w:t>Разбор записи о поезде</w:t>
-      </w:r>
-    </w:p>
-    <w:p>
-      <w:pPr>
-        <w:spacing w:after="0" w:line="360" w:lineRule="auto"/>
-        <w:ind w:firstLine="709"/>
-        <w:jc w:val="both"/>
-        <w:rPr>
-          <w:rFonts w:ascii="Times New Roman" w:hAnsi="Times New Roman" w:cs="Times New Roman"/>
-          <w:color w:val="000000"/>
-          <w:sz w:val="24"/>
-          <w:szCs w:val="24"/>
-          <w:lang w:val="ru-RU"/>
-        </w:rPr>
-      </w:pPr>
-      <w:r>
-        <w:rPr>
-          <w:rFonts w:ascii="Times New Roman" w:hAnsi="Times New Roman" w:cs="Times New Roman"/>
-          <w:color w:val="000000"/>
-          <w:sz w:val="24"/>
-          <w:szCs w:val="24"/>
-          <w:lang w:val="ru-RU"/>
-        </w:rPr>
-        <w:t>В четвертом задании осуществляется синтаксический разбор строки с данными о поезде, где поля разделены точкой с запятой. Программа должна распределить данные по переменным и вывести структурированную запись. Для поля стоимости требуется настроить вывод вещественного числа ровно с двумя знаками после запятой.</w:t>
-      </w:r>
-    </w:p>
-    <w:p>
-      <w:pPr>
-        <w:spacing w:after="0" w:line="360" w:lineRule="auto"/>
-        <w:ind w:firstLine="709"/>
-        <w:jc w:val="both"/>
-        <w:rPr>
-          <w:rFonts w:ascii="Times New Roman" w:hAnsi="Times New Roman" w:cs="Times New Roman"/>
-          <w:color w:val="000000"/>
-          <w:sz w:val="24"/>
-          <w:szCs w:val="24"/>
-          <w:lang w:val="ru-RU"/>
-        </w:rPr>
-      </w:pPr>
-      <w:r>
-        <w:rPr>
-          <w:rFonts w:ascii="Times New Roman" w:hAnsi="Times New Roman" w:cs="Times New Roman"/>
-          <w:color w:val="000000"/>
-          <w:sz w:val="24"/>
-          <w:szCs w:val="24"/>
-          <w:lang w:val="ru-RU"/>
-        </w:rPr>
-        <w:t>Алгоритм решения задания представлен на рисунке 7.</w:t>
-      </w:r>
-    </w:p>
-    <w:p>
-      <w:pPr>
-        <w:spacing w:after="80" w:line="360" w:lineRule="auto"/>
-        <w:ind w:firstLine="709"/>
-        <w:jc w:val="center"/>
-        <w:rPr>
-          <w:sz w:val="24"/>
-          <w:szCs w:val="24"/>
-          <w:lang w:val="ru-RU"/>
-        </w:rPr>
-      </w:pPr>
-      <w:r>
-        <w:rPr>
           <w:noProof/>
-          <w:sz w:val="24"/>
-          <w:szCs w:val="24"/>
-          <w:lang w:val="ru-RU"/>
-        </w:rPr>
-        <w:lastRenderedPageBreak/>
+          <w:color w:val="000000"/>
+          <w:sz w:val="24"/>
+          <w:szCs w:val="24"/>
+          <w:lang w:val="ru-RU"/>
+        </w:rPr>
         <w:drawing>
-          <wp:inline distT="0" distB="0" distL="0" distR="0" wp14:anchorId="72A40C7C" wp14:editId="1794DD28">
-            <wp:extent cx="2752725" cy="4876800"/>
-            <wp:effectExtent l="0" t="0" r="9525" b="0"/>
-            <wp:docPr id="10" name="Рисунок 10"/>
+          <wp:inline distT="0" distB="0" distL="0" distR="0" wp14:anchorId="61A27C37" wp14:editId="3827E0E4">
+            <wp:extent cx="3105150" cy="4972050"/>
+            <wp:effectExtent l="0" t="0" r="0" b="0"/>
+            <wp:docPr id="8" name="Рисунок 8"/>
             <wp:cNvGraphicFramePr>
               <a:graphicFrameLocks xmlns:a="http://schemas.openxmlformats.org/drawingml/2006/main" noChangeAspect="1"/>
             </wp:cNvGraphicFramePr>
@@ -2233,7 +1849,7 @@
               <a:graphicData uri="http://schemas.openxmlformats.org/drawingml/2006/picture">
                 <pic:pic xmlns:pic="http://schemas.openxmlformats.org/drawingml/2006/picture">
                   <pic:nvPicPr>
-                    <pic:cNvPr id="10" name="Рисунок 10"/>
+                    <pic:cNvPr id="8" name="Рисунок 8"/>
                     <pic:cNvPicPr/>
                   </pic:nvPicPr>
                   <pic:blipFill>
@@ -2245,7 +1861,7 @@
                   <pic:spPr>
                     <a:xfrm>
                       <a:off x="0" y="0"/>
-                      <a:ext cx="2752725" cy="4876800"/>
+                      <a:ext cx="3105150" cy="4972050"/>
                     </a:xfrm>
                     <a:prstGeom prst="rect">
                       <a:avLst/>
@@ -2262,72 +1878,83 @@
       <w:pPr>
         <w:spacing w:after="80" w:line="360" w:lineRule="auto"/>
         <w:ind w:firstLine="709"/>
-        <w:jc w:val="center"/>
-        <w:rPr>
-          <w:rFonts w:ascii="Times New Roman" w:hAnsi="Times New Roman"/>
-          <w:color w:val="000000"/>
-          <w:sz w:val="24"/>
-          <w:szCs w:val="24"/>
-          <w:lang w:val="ru-RU"/>
-        </w:rPr>
-      </w:pPr>
-      <w:r>
+        <w:jc w:val="both"/>
         <w:rPr>
           <w:rFonts w:ascii="Times New Roman" w:hAnsi="Times New Roman" w:cs="Times New Roman"/>
-          <w:sz w:val="24"/>
-          <w:szCs w:val="24"/>
-          <w:lang w:val="ru-RU"/>
-        </w:rPr>
-        <w:t xml:space="preserve">Рисунок 7 </w:t>
-      </w:r>
-      <w:r>
-        <w:rPr>
-          <w:rFonts w:ascii="Times New Roman" w:hAnsi="Times New Roman"/>
-          <w:color w:val="000000"/>
-          <w:sz w:val="24"/>
-          <w:szCs w:val="24"/>
-          <w:lang w:val="ru-RU"/>
-        </w:rPr>
-        <w:t>–</w:t>
-      </w:r>
-      <w:r>
-        <w:rPr>
-          <w:rFonts w:ascii="Times New Roman" w:hAnsi="Times New Roman"/>
-          <w:color w:val="000000"/>
-          <w:sz w:val="24"/>
-          <w:szCs w:val="24"/>
-          <w:lang w:val="ru-RU"/>
-        </w:rPr>
-        <w:t xml:space="preserve"> Блок-схема программы</w:t>
-      </w:r>
+          <w:color w:val="000000"/>
+          <w:sz w:val="24"/>
+          <w:szCs w:val="24"/>
+          <w:lang w:val="ru-RU"/>
+        </w:rPr>
+      </w:pPr>
     </w:p>
     <w:p>
       <w:pPr>
-        <w:spacing w:after="80" w:line="360" w:lineRule="auto"/>
+        <w:spacing w:before="80" w:after="120" w:line="360" w:lineRule="auto"/>
+        <w:ind w:firstLine="709"/>
+        <w:jc w:val="center"/>
+        <w:rPr>
+          <w:rFonts w:ascii="Times New Roman" w:hAnsi="Times New Roman" w:cs="Times New Roman"/>
+          <w:sz w:val="24"/>
+          <w:szCs w:val="24"/>
+          <w:lang w:val="ru-RU"/>
+        </w:rPr>
+      </w:pPr>
+      <w:r>
+        <w:rPr>
+          <w:rFonts w:ascii="Times New Roman" w:hAnsi="Times New Roman" w:cs="Times New Roman"/>
+          <w:sz w:val="24"/>
+          <w:szCs w:val="24"/>
+          <w:lang w:val="ru-RU"/>
+        </w:rPr>
+        <w:t xml:space="preserve">Рисунок 5 </w:t>
+      </w:r>
+      <w:r>
+        <w:rPr>
+          <w:rFonts w:ascii="Times New Roman" w:hAnsi="Times New Roman"/>
+          <w:color w:val="000000"/>
+          <w:sz w:val="24"/>
+          <w:szCs w:val="24"/>
+          <w:lang w:val="ru-RU"/>
+        </w:rPr>
+        <w:t>–</w:t>
+      </w:r>
+      <w:r>
+        <w:rPr>
+          <w:rFonts w:ascii="Times New Roman" w:hAnsi="Times New Roman"/>
+          <w:color w:val="000000"/>
+          <w:sz w:val="24"/>
+          <w:szCs w:val="24"/>
+          <w:lang w:val="ru-RU"/>
+        </w:rPr>
+        <w:t xml:space="preserve"> Блок-схема программы</w:t>
+      </w:r>
+    </w:p>
+    <w:p>
+      <w:pPr>
+        <w:spacing w:before="80" w:after="120" w:line="360" w:lineRule="auto"/>
         <w:ind w:firstLine="709"/>
         <w:jc w:val="both"/>
         <w:rPr>
-          <w:rFonts w:ascii="Times New Roman" w:hAnsi="Times New Roman"/>
-          <w:color w:val="000000"/>
-          <w:sz w:val="24"/>
-          <w:szCs w:val="24"/>
-          <w:lang w:val="ru-RU"/>
-        </w:rPr>
-      </w:pPr>
-      <w:r>
-        <w:rPr>
-          <w:rFonts w:ascii="Times New Roman" w:hAnsi="Times New Roman"/>
-          <w:color w:val="000000"/>
-          <w:sz w:val="24"/>
-          <w:szCs w:val="24"/>
-          <w:lang w:val="ru-RU"/>
-        </w:rPr>
-        <w:t>Текст программы предоставлен на рисунке 8.</w:t>
+          <w:rFonts w:ascii="Times New Roman" w:hAnsi="Times New Roman" w:cs="Times New Roman"/>
+          <w:sz w:val="24"/>
+          <w:szCs w:val="24"/>
+          <w:lang w:val="ru-RU"/>
+        </w:rPr>
+      </w:pPr>
+      <w:r>
+        <w:rPr>
+          <w:rFonts w:ascii="Times New Roman" w:hAnsi="Times New Roman" w:cs="Times New Roman"/>
+          <w:sz w:val="24"/>
+          <w:szCs w:val="24"/>
+          <w:lang w:val="ru-RU"/>
+        </w:rPr>
+        <w:t>Текст программы представлен на рисунке 6.</w:t>
       </w:r>
     </w:p>
     <w:p>
       <w:pPr>
-        <w:spacing w:after="80" w:line="360" w:lineRule="auto"/>
+        <w:spacing w:before="80" w:after="120" w:line="360" w:lineRule="auto"/>
         <w:ind w:firstLine="709"/>
         <w:jc w:val="center"/>
         <w:rPr>
@@ -2346,10 +1973,10 @@
         </w:rPr>
         <w:lastRenderedPageBreak/>
         <w:drawing>
-          <wp:inline distT="0" distB="0" distL="0" distR="0" wp14:anchorId="6F241327" wp14:editId="2FD4DD03">
-            <wp:extent cx="5601482" cy="3458058"/>
-            <wp:effectExtent l="0" t="0" r="0" b="9525"/>
-            <wp:docPr id="11" name="Рисунок 11"/>
+          <wp:inline distT="0" distB="0" distL="0" distR="0" wp14:anchorId="3F1FA3EF" wp14:editId="3BE0CDCF">
+            <wp:extent cx="5134692" cy="2324424"/>
+            <wp:effectExtent l="0" t="0" r="8890" b="0"/>
+            <wp:docPr id="9" name="Рисунок 9"/>
             <wp:cNvGraphicFramePr>
               <a:graphicFrameLocks xmlns:a="http://schemas.openxmlformats.org/drawingml/2006/main" noChangeAspect="1"/>
             </wp:cNvGraphicFramePr>
@@ -2369,7 +1996,7 @@
                   <pic:spPr>
                     <a:xfrm>
                       <a:off x="0" y="0"/>
-                      <a:ext cx="5601482" cy="3458058"/>
+                      <a:ext cx="5134692" cy="2324424"/>
                     </a:xfrm>
                     <a:prstGeom prst="rect">
                       <a:avLst/>
@@ -2396,21 +2023,22 @@
       </w:pPr>
       <w:r>
         <w:rPr>
-          <w:rFonts w:ascii="Times New Roman" w:hAnsi="Times New Roman" w:cs="Times New Roman"/>
-          <w:sz w:val="24"/>
-          <w:szCs w:val="24"/>
-          <w:lang w:val="ru-RU"/>
-        </w:rPr>
-        <w:t xml:space="preserve">Рисунок 8 </w:t>
-      </w:r>
-      <w:r>
-        <w:rPr>
           <w:rFonts w:ascii="Times New Roman" w:hAnsi="Times New Roman"/>
           <w:color w:val="000000"/>
           <w:sz w:val="24"/>
           <w:szCs w:val="24"/>
           <w:lang w:val="ru-RU"/>
         </w:rPr>
+        <w:t xml:space="preserve">Рисунок 6 </w:t>
+      </w:r>
+      <w:r>
+        <w:rPr>
+          <w:rFonts w:ascii="Times New Roman" w:hAnsi="Times New Roman"/>
+          <w:color w:val="000000"/>
+          <w:sz w:val="24"/>
+          <w:szCs w:val="24"/>
+          <w:lang w:val="ru-RU"/>
+        </w:rPr>
         <w:t>–</w:t>
       </w:r>
       <w:r>
@@ -2430,7 +2058,7 @@
           <w:sz w:val="24"/>
           <w:szCs w:val="24"/>
         </w:rPr>
-        <w:t>task34.py</w:t>
+        <w:t>task33.py</w:t>
       </w:r>
     </w:p>
     <w:p>
@@ -2452,7 +2080,7 @@
           <w:szCs w:val="24"/>
           <w:lang w:val="ru-RU"/>
         </w:rPr>
-        <w:t xml:space="preserve">В данном задании строка разделяется на список элементов с помощью </w:t>
+        <w:t xml:space="preserve">В данном задании очистка строки от нежелательных артефактов ввода выполняется за счет каскадного вызова встроенного строкового метода </w:t>
       </w:r>
       <w:proofErr w:type="gramStart"/>
       <w:r>
@@ -2461,7 +2089,7 @@
           <w:sz w:val="24"/>
           <w:szCs w:val="24"/>
         </w:rPr>
-        <w:t>split</w:t>
+        <w:t>replace</w:t>
       </w:r>
       <w:r>
         <w:rPr>
@@ -2480,35 +2108,7 @@
           <w:szCs w:val="24"/>
           <w:lang w:val="ru-RU"/>
         </w:rPr>
-        <w:t xml:space="preserve">";"). Чтобы дополнить дробную часть цены нулями, строковое значение конвертируется в вещественный тип данных </w:t>
-      </w:r>
-      <w:proofErr w:type="gramStart"/>
-      <w:r>
-        <w:rPr>
-          <w:rFonts w:ascii="Times New Roman" w:hAnsi="Times New Roman" w:cs="Times New Roman"/>
-          <w:sz w:val="24"/>
-          <w:szCs w:val="24"/>
-        </w:rPr>
-        <w:t>float</w:t>
-      </w:r>
-      <w:r>
-        <w:rPr>
-          <w:rFonts w:ascii="Times New Roman" w:hAnsi="Times New Roman" w:cs="Times New Roman"/>
-          <w:sz w:val="24"/>
-          <w:szCs w:val="24"/>
-          <w:lang w:val="ru-RU"/>
-        </w:rPr>
-        <w:t>(</w:t>
-      </w:r>
-      <w:proofErr w:type="gramEnd"/>
-      <w:r>
-        <w:rPr>
-          <w:rFonts w:ascii="Times New Roman" w:hAnsi="Times New Roman" w:cs="Times New Roman"/>
-          <w:sz w:val="24"/>
-          <w:szCs w:val="24"/>
-          <w:lang w:val="ru-RU"/>
-        </w:rPr>
-        <w:t>), после чего внутри F-строки применяется спецификатор формата :.2f.</w:t>
+        <w:t>), который заменяет заданные символы на пустые строки "", эффективно удаляя их из итогового результата.</w:t>
       </w:r>
     </w:p>
     <w:p>
@@ -2540,9 +2140,8 @@
           <w:color w:val="000000"/>
           <w:sz w:val="26"/>
           <w:szCs w:val="26"/>
-          <w:lang w:val="ru-RU"/>
-        </w:rPr>
-        <w:t xml:space="preserve">5 </w:t>
+        </w:rPr>
+        <w:t xml:space="preserve">4 </w:t>
       </w:r>
       <w:r>
         <w:rPr>
@@ -2552,7 +2151,7 @@
           <w:szCs w:val="26"/>
           <w:lang w:val="ru-RU"/>
         </w:rPr>
-        <w:t>Проверка идентификатора</w:t>
+        <w:t>Разбор записи о поезде</w:t>
       </w:r>
     </w:p>
     <w:p>
@@ -2562,6 +2161,7 @@
         <w:jc w:val="both"/>
         <w:rPr>
           <w:rFonts w:ascii="Times New Roman" w:hAnsi="Times New Roman" w:cs="Times New Roman"/>
+          <w:color w:val="000000"/>
           <w:sz w:val="24"/>
           <w:szCs w:val="24"/>
           <w:lang w:val="ru-RU"/>
@@ -2570,11 +2170,12 @@
       <w:r>
         <w:rPr>
           <w:rFonts w:ascii="Times New Roman" w:hAnsi="Times New Roman" w:cs="Times New Roman"/>
-          <w:sz w:val="24"/>
-          <w:szCs w:val="24"/>
-          <w:lang w:val="ru-RU"/>
-        </w:rPr>
-        <w:t>В пятом задании программа выполняет комплексный анализ введенного пользователем текстового идентификатора. Требуется определить полную длину строки, а также провести четыре независимые проверки: состоит ли строка только из букв, только из цифр, является ли буквенно-цифровой и содержит ли символ дефиса.</w:t>
+          <w:color w:val="000000"/>
+          <w:sz w:val="24"/>
+          <w:szCs w:val="24"/>
+          <w:lang w:val="ru-RU"/>
+        </w:rPr>
+        <w:t>В четвертом задании осуществляется синтаксический разбор строки с данными о поезде, где поля разделены точкой с запятой. Программа должна распределить данные по переменным и вывести структурированную запись. Для поля стоимости требуется настроить вывод вещественного числа ровно с двумя знаками после запятой.</w:t>
       </w:r>
     </w:p>
     <w:p>
@@ -2598,27 +2199,7 @@
           <w:szCs w:val="24"/>
           <w:lang w:val="ru-RU"/>
         </w:rPr>
-        <w:t xml:space="preserve">Алгоритм решения задания представлен на рисунке </w:t>
-      </w:r>
-      <w:r>
-        <w:rPr>
-          <w:rFonts w:ascii="Times New Roman" w:hAnsi="Times New Roman" w:cs="Times New Roman"/>
-          <w:color w:val="000000"/>
-          <w:sz w:val="24"/>
-          <w:szCs w:val="24"/>
-          <w:lang w:val="ru-RU"/>
-        </w:rPr>
-        <w:t>9</w:t>
-      </w:r>
-      <w:r>
-        <w:rPr>
-          <w:rFonts w:ascii="Times New Roman" w:hAnsi="Times New Roman" w:cs="Times New Roman"/>
-          <w:color w:val="000000"/>
-          <w:sz w:val="24"/>
-          <w:szCs w:val="24"/>
-          <w:lang w:val="ru-RU"/>
-        </w:rPr>
-        <w:t>.</w:t>
+        <w:t>Алгоритм решения задания представлен на рисунке 7.</w:t>
       </w:r>
     </w:p>
     <w:p>
@@ -2627,15 +2208,13 @@
         <w:ind w:firstLine="709"/>
         <w:jc w:val="center"/>
         <w:rPr>
-          <w:rFonts w:ascii="Times New Roman" w:hAnsi="Times New Roman" w:cs="Times New Roman"/>
-          <w:sz w:val="24"/>
-          <w:szCs w:val="24"/>
-          <w:lang w:val="ru-RU"/>
-        </w:rPr>
-      </w:pPr>
-      <w:r>
-        <w:rPr>
-          <w:rFonts w:ascii="Times New Roman" w:hAnsi="Times New Roman" w:cs="Times New Roman"/>
+          <w:sz w:val="24"/>
+          <w:szCs w:val="24"/>
+          <w:lang w:val="ru-RU"/>
+        </w:rPr>
+      </w:pPr>
+      <w:r>
+        <w:rPr>
           <w:noProof/>
           <w:sz w:val="24"/>
           <w:szCs w:val="24"/>
@@ -2643,10 +2222,10 @@
         </w:rPr>
         <w:lastRenderedPageBreak/>
         <w:drawing>
-          <wp:inline distT="0" distB="0" distL="0" distR="0" wp14:anchorId="3B594509" wp14:editId="04753323">
-            <wp:extent cx="2571750" cy="4686300"/>
-            <wp:effectExtent l="0" t="0" r="0" b="0"/>
-            <wp:docPr id="12" name="Рисунок 12"/>
+          <wp:inline distT="0" distB="0" distL="0" distR="0" wp14:anchorId="72A40C7C" wp14:editId="1794DD28">
+            <wp:extent cx="2752725" cy="4876800"/>
+            <wp:effectExtent l="0" t="0" r="9525" b="0"/>
+            <wp:docPr id="10" name="Рисунок 10"/>
             <wp:cNvGraphicFramePr>
               <a:graphicFrameLocks xmlns:a="http://schemas.openxmlformats.org/drawingml/2006/main" noChangeAspect="1"/>
             </wp:cNvGraphicFramePr>
@@ -2654,7 +2233,7 @@
               <a:graphicData uri="http://schemas.openxmlformats.org/drawingml/2006/picture">
                 <pic:pic xmlns:pic="http://schemas.openxmlformats.org/drawingml/2006/picture">
                   <pic:nvPicPr>
-                    <pic:cNvPr id="12" name="Рисунок 12"/>
+                    <pic:cNvPr id="10" name="Рисунок 10"/>
                     <pic:cNvPicPr/>
                   </pic:nvPicPr>
                   <pic:blipFill>
@@ -2666,7 +2245,7 @@
                   <pic:spPr>
                     <a:xfrm>
                       <a:off x="0" y="0"/>
-                      <a:ext cx="2571750" cy="4686300"/>
+                      <a:ext cx="2752725" cy="4876800"/>
                     </a:xfrm>
                     <a:prstGeom prst="rect">
                       <a:avLst/>
@@ -2699,25 +2278,7 @@
           <w:szCs w:val="24"/>
           <w:lang w:val="ru-RU"/>
         </w:rPr>
-        <w:t xml:space="preserve">Рисунок </w:t>
-      </w:r>
-      <w:r>
-        <w:rPr>
-          <w:rFonts w:ascii="Times New Roman" w:hAnsi="Times New Roman" w:cs="Times New Roman"/>
-          <w:sz w:val="24"/>
-          <w:szCs w:val="24"/>
-          <w:lang w:val="ru-RU"/>
-        </w:rPr>
-        <w:t>9</w:t>
-      </w:r>
-      <w:r>
-        <w:rPr>
-          <w:rFonts w:ascii="Times New Roman" w:hAnsi="Times New Roman" w:cs="Times New Roman"/>
-          <w:sz w:val="24"/>
-          <w:szCs w:val="24"/>
-          <w:lang w:val="ru-RU"/>
-        </w:rPr>
-        <w:t xml:space="preserve"> </w:t>
+        <w:t xml:space="preserve">Рисунок 7 </w:t>
       </w:r>
       <w:r>
         <w:rPr>
@@ -2742,7 +2303,7 @@
     </w:p>
     <w:p>
       <w:pPr>
-        <w:spacing w:after="0" w:line="360" w:lineRule="auto"/>
+        <w:spacing w:after="80" w:line="360" w:lineRule="auto"/>
         <w:ind w:firstLine="709"/>
         <w:jc w:val="both"/>
         <w:rPr>
@@ -2761,27 +2322,7 @@
           <w:szCs w:val="24"/>
           <w:lang w:val="ru-RU"/>
         </w:rPr>
-        <w:t xml:space="preserve">Текст программы предоставлен на рисунке </w:t>
-      </w:r>
-      <w:r>
-        <w:rPr>
-          <w:rFonts w:ascii="Times New Roman" w:hAnsi="Times New Roman"/>
-          <w:color w:val="000000"/>
-          <w:sz w:val="24"/>
-          <w:szCs w:val="24"/>
-          <w:lang w:val="ru-RU"/>
-        </w:rPr>
-        <w:t>10</w:t>
-      </w:r>
-      <w:r>
-        <w:rPr>
-          <w:rFonts w:ascii="Times New Roman" w:hAnsi="Times New Roman"/>
-          <w:color w:val="000000"/>
-          <w:sz w:val="24"/>
-          <w:szCs w:val="24"/>
-          <w:lang w:val="ru-RU"/>
-        </w:rPr>
-        <w:t>.</w:t>
+        <w:t>Текст программы предоставлен на рисунке 8.</w:t>
       </w:r>
     </w:p>
     <w:p>
@@ -2805,10 +2346,10 @@
         </w:rPr>
         <w:lastRenderedPageBreak/>
         <w:drawing>
-          <wp:inline distT="0" distB="0" distL="0" distR="0" wp14:anchorId="0D0EA46F" wp14:editId="05C6F545">
-            <wp:extent cx="4582164" cy="3686689"/>
-            <wp:effectExtent l="0" t="0" r="8890" b="9525"/>
-            <wp:docPr id="13" name="Рисунок 13"/>
+          <wp:inline distT="0" distB="0" distL="0" distR="0" wp14:anchorId="6F241327" wp14:editId="2FD4DD03">
+            <wp:extent cx="5601482" cy="3458058"/>
+            <wp:effectExtent l="0" t="0" r="0" b="9525"/>
+            <wp:docPr id="11" name="Рисунок 11"/>
             <wp:cNvGraphicFramePr>
               <a:graphicFrameLocks xmlns:a="http://schemas.openxmlformats.org/drawingml/2006/main" noChangeAspect="1"/>
             </wp:cNvGraphicFramePr>
@@ -2828,7 +2369,7 @@
                   <pic:spPr>
                     <a:xfrm>
                       <a:off x="0" y="0"/>
-                      <a:ext cx="4582164" cy="3686689"/>
+                      <a:ext cx="5601482" cy="3458058"/>
                     </a:xfrm>
                     <a:prstGeom prst="rect">
                       <a:avLst/>
@@ -2851,7 +2392,6 @@
           <w:color w:val="000000"/>
           <w:sz w:val="24"/>
           <w:szCs w:val="24"/>
-          <w:lang w:val="ru-RU"/>
         </w:rPr>
       </w:pPr>
       <w:r>
@@ -2861,25 +2401,7 @@
           <w:szCs w:val="24"/>
           <w:lang w:val="ru-RU"/>
         </w:rPr>
-        <w:t xml:space="preserve">Рисунок </w:t>
-      </w:r>
-      <w:r>
-        <w:rPr>
-          <w:rFonts w:ascii="Times New Roman" w:hAnsi="Times New Roman" w:cs="Times New Roman"/>
-          <w:sz w:val="24"/>
-          <w:szCs w:val="24"/>
-          <w:lang w:val="ru-RU"/>
-        </w:rPr>
-        <w:t>10</w:t>
-      </w:r>
-      <w:r>
-        <w:rPr>
-          <w:rFonts w:ascii="Times New Roman" w:hAnsi="Times New Roman" w:cs="Times New Roman"/>
-          <w:sz w:val="24"/>
-          <w:szCs w:val="24"/>
-          <w:lang w:val="ru-RU"/>
-        </w:rPr>
-        <w:t xml:space="preserve"> </w:t>
+        <w:t xml:space="preserve">Рисунок 8 </w:t>
       </w:r>
       <w:r>
         <w:rPr>
@@ -2908,49 +2430,8 @@
           <w:sz w:val="24"/>
           <w:szCs w:val="24"/>
         </w:rPr>
-        <w:t>task</w:t>
-      </w:r>
-      <w:r>
-        <w:rPr>
-          <w:rFonts w:ascii="Times New Roman" w:hAnsi="Times New Roman"/>
-          <w:color w:val="000000"/>
-          <w:sz w:val="24"/>
-          <w:szCs w:val="24"/>
-          <w:lang w:val="ru-RU"/>
-        </w:rPr>
-        <w:t>3</w:t>
-      </w:r>
-      <w:r>
-        <w:rPr>
-          <w:rFonts w:ascii="Times New Roman" w:hAnsi="Times New Roman"/>
-          <w:color w:val="000000"/>
-          <w:sz w:val="24"/>
-          <w:szCs w:val="24"/>
-          <w:lang w:val="ru-RU"/>
-        </w:rPr>
-        <w:t>5</w:t>
-      </w:r>
-      <w:r>
-        <w:rPr>
-          <w:rFonts w:ascii="Times New Roman" w:hAnsi="Times New Roman"/>
-          <w:color w:val="000000"/>
-          <w:sz w:val="24"/>
-          <w:szCs w:val="24"/>
-          <w:lang w:val="ru-RU"/>
-        </w:rPr>
-        <w:t>.</w:t>
-      </w:r>
-      <w:proofErr w:type="spellStart"/>
-      <w:r>
-        <w:rPr>
-          <w:rFonts w:ascii="Times New Roman" w:hAnsi="Times New Roman"/>
-          <w:color w:val="000000"/>
-          <w:sz w:val="24"/>
-          <w:szCs w:val="24"/>
-        </w:rPr>
-        <w:t>py</w:t>
-      </w:r>
-      <w:proofErr w:type="spellEnd"/>
+        <w:t>task34.py</w:t>
+      </w:r>
     </w:p>
     <w:p>
       <w:pPr>
@@ -2961,6 +2442,7 @@
           <w:rFonts w:ascii="Times New Roman" w:hAnsi="Times New Roman" w:cs="Times New Roman"/>
           <w:sz w:val="24"/>
           <w:szCs w:val="24"/>
+          <w:lang w:val="ru-RU"/>
         </w:rPr>
       </w:pPr>
       <w:r>
@@ -2970,9 +2452,8 @@
           <w:szCs w:val="24"/>
           <w:lang w:val="ru-RU"/>
         </w:rPr>
-        <w:t xml:space="preserve">В данном задании для первых трех проверок используются встроенные логические (булевы) методы строк </w:t>
-      </w:r>
-      <w:proofErr w:type="spellStart"/>
+        <w:t xml:space="preserve">В данном задании строка разделяется на список элементов с помощью </w:t>
+      </w:r>
       <w:proofErr w:type="gramStart"/>
       <w:r>
         <w:rPr>
@@ -2980,9 +2461,8 @@
           <w:sz w:val="24"/>
           <w:szCs w:val="24"/>
         </w:rPr>
-        <w:t>isalpha</w:t>
-      </w:r>
-      <w:proofErr w:type="spellEnd"/>
+        <w:t>split</w:t>
+      </w:r>
       <w:r>
         <w:rPr>
           <w:rFonts w:ascii="Times New Roman" w:hAnsi="Times New Roman" w:cs="Times New Roman"/>
@@ -3000,18 +2480,17 @@
           <w:szCs w:val="24"/>
           <w:lang w:val="ru-RU"/>
         </w:rPr>
-        <w:t xml:space="preserve">), </w:t>
-      </w:r>
-      <w:proofErr w:type="spellStart"/>
+        <w:t xml:space="preserve">";"). Чтобы дополнить дробную часть цены нулями, строковое значение конвертируется в вещественный тип данных </w:t>
+      </w:r>
+      <w:proofErr w:type="gramStart"/>
       <w:r>
         <w:rPr>
           <w:rFonts w:ascii="Times New Roman" w:hAnsi="Times New Roman" w:cs="Times New Roman"/>
           <w:sz w:val="24"/>
           <w:szCs w:val="24"/>
         </w:rPr>
-        <w:t>isdigit</w:t>
-      </w:r>
-      <w:proofErr w:type="spellEnd"/>
+        <w:t>float</w:t>
+      </w:r>
       <w:r>
         <w:rPr>
           <w:rFonts w:ascii="Times New Roman" w:hAnsi="Times New Roman" w:cs="Times New Roman"/>
@@ -3019,8 +2498,9 @@
           <w:szCs w:val="24"/>
           <w:lang w:val="ru-RU"/>
         </w:rPr>
-        <w:t>() и</w:t>
-      </w:r>
+        <w:t>(</w:t>
+      </w:r>
+      <w:proofErr w:type="gramEnd"/>
       <w:r>
         <w:rPr>
           <w:rFonts w:ascii="Times New Roman" w:hAnsi="Times New Roman" w:cs="Times New Roman"/>
@@ -3028,103 +2508,7 @@
           <w:szCs w:val="24"/>
           <w:lang w:val="ru-RU"/>
         </w:rPr>
-        <w:t xml:space="preserve"> </w:t>
-      </w:r>
-      <w:proofErr w:type="spellStart"/>
-      <w:r>
-        <w:rPr>
-          <w:rFonts w:ascii="Times New Roman" w:hAnsi="Times New Roman" w:cs="Times New Roman"/>
-          <w:sz w:val="24"/>
-          <w:szCs w:val="24"/>
-        </w:rPr>
-        <w:t>isalnum</w:t>
-      </w:r>
-      <w:proofErr w:type="spellEnd"/>
-      <w:r>
-        <w:rPr>
-          <w:rFonts w:ascii="Times New Roman" w:hAnsi="Times New Roman" w:cs="Times New Roman"/>
-          <w:sz w:val="24"/>
-          <w:szCs w:val="24"/>
-          <w:lang w:val="ru-RU"/>
-        </w:rPr>
-        <w:t>()</w:t>
-      </w:r>
-      <w:r>
-        <w:rPr>
-          <w:rFonts w:ascii="Times New Roman" w:hAnsi="Times New Roman" w:cs="Times New Roman"/>
-          <w:sz w:val="24"/>
-          <w:szCs w:val="24"/>
-          <w:lang w:val="ru-RU"/>
-        </w:rPr>
-        <w:t xml:space="preserve">. Наличие дефиса проверяется с помощью оператора вхождения </w:t>
-      </w:r>
-      <w:proofErr w:type="spellStart"/>
-      <w:r>
-        <w:rPr>
-          <w:rFonts w:ascii="Times New Roman" w:hAnsi="Times New Roman" w:cs="Times New Roman"/>
-          <w:sz w:val="24"/>
-          <w:szCs w:val="24"/>
-          <w:lang w:val="ru-RU"/>
-        </w:rPr>
-        <w:t>in</w:t>
-      </w:r>
-      <w:proofErr w:type="spellEnd"/>
-      <w:r>
-        <w:rPr>
-          <w:rFonts w:ascii="Times New Roman" w:hAnsi="Times New Roman" w:cs="Times New Roman"/>
-          <w:sz w:val="24"/>
-          <w:szCs w:val="24"/>
-          <w:lang w:val="ru-RU"/>
-        </w:rPr>
-        <w:t xml:space="preserve">. Длина вычисляется базовой функцией </w:t>
-      </w:r>
-      <w:proofErr w:type="spellStart"/>
-      <w:proofErr w:type="gramStart"/>
-      <w:r>
-        <w:rPr>
-          <w:rFonts w:ascii="Times New Roman" w:hAnsi="Times New Roman" w:cs="Times New Roman"/>
-          <w:sz w:val="24"/>
-          <w:szCs w:val="24"/>
-          <w:lang w:val="ru-RU"/>
-        </w:rPr>
-        <w:t>len</w:t>
-      </w:r>
-      <w:proofErr w:type="spellEnd"/>
-      <w:r>
-        <w:rPr>
-          <w:rFonts w:ascii="Times New Roman" w:hAnsi="Times New Roman" w:cs="Times New Roman"/>
-          <w:sz w:val="24"/>
-          <w:szCs w:val="24"/>
-          <w:lang w:val="ru-RU"/>
-        </w:rPr>
-        <w:t>(</w:t>
-      </w:r>
-      <w:proofErr w:type="gramEnd"/>
-      <w:r>
-        <w:rPr>
-          <w:rFonts w:ascii="Times New Roman" w:hAnsi="Times New Roman" w:cs="Times New Roman"/>
-          <w:sz w:val="24"/>
-          <w:szCs w:val="24"/>
-          <w:lang w:val="ru-RU"/>
-        </w:rPr>
-        <w:t xml:space="preserve">). Все результаты выводятся в виде логических значений True или </w:t>
-      </w:r>
-      <w:r>
-        <w:rPr>
-          <w:rFonts w:ascii="Times New Roman" w:hAnsi="Times New Roman" w:cs="Times New Roman"/>
-          <w:sz w:val="24"/>
-          <w:szCs w:val="24"/>
-        </w:rPr>
-        <w:t>False</w:t>
-      </w:r>
-      <w:r>
-        <w:rPr>
-          <w:rFonts w:ascii="Times New Roman" w:hAnsi="Times New Roman" w:cs="Times New Roman"/>
-          <w:sz w:val="24"/>
-          <w:szCs w:val="24"/>
-          <w:lang w:val="ru-RU"/>
-        </w:rPr>
-        <w:t>.</w:t>
+        <w:t>), после чего внутри F-строки применяется спецификатор формата :.2f.</w:t>
       </w:r>
     </w:p>
     <w:p>
@@ -3158,7 +2542,7 @@
           <w:szCs w:val="26"/>
           <w:lang w:val="ru-RU"/>
         </w:rPr>
-        <w:t>6</w:t>
+        <w:t xml:space="preserve">5 </w:t>
       </w:r>
       <w:r>
         <w:rPr>
@@ -3168,26 +2552,16 @@
           <w:szCs w:val="26"/>
           <w:lang w:val="ru-RU"/>
         </w:rPr>
-        <w:t xml:space="preserve"> </w:t>
-      </w:r>
-      <w:r>
-        <w:rPr>
-          <w:rFonts w:ascii="Arial" w:hAnsi="Arial" w:cs="Arial"/>
-          <w:color w:val="000000"/>
-          <w:sz w:val="26"/>
-          <w:szCs w:val="26"/>
-          <w:lang w:val="ru-RU"/>
-        </w:rPr>
-        <w:t>Формирование пути</w:t>
+        <w:t>Проверка идентификатора</w:t>
       </w:r>
     </w:p>
     <w:p>
       <w:pPr>
         <w:spacing w:after="0" w:line="360" w:lineRule="auto"/>
         <w:ind w:firstLine="709"/>
+        <w:jc w:val="both"/>
         <w:rPr>
           <w:rFonts w:ascii="Times New Roman" w:hAnsi="Times New Roman" w:cs="Times New Roman"/>
-          <w:color w:val="000000"/>
           <w:sz w:val="24"/>
           <w:szCs w:val="24"/>
           <w:lang w:val="ru-RU"/>
@@ -3196,48 +2570,18 @@
       <w:r>
         <w:rPr>
           <w:rFonts w:ascii="Times New Roman" w:hAnsi="Times New Roman" w:cs="Times New Roman"/>
-          <w:color w:val="000000"/>
-          <w:sz w:val="24"/>
-          <w:szCs w:val="24"/>
-          <w:lang w:val="ru-RU"/>
-        </w:rPr>
-        <w:t xml:space="preserve">В </w:t>
-      </w:r>
-      <w:r>
-        <w:rPr>
-          <w:rFonts w:ascii="Times New Roman" w:hAnsi="Times New Roman" w:cs="Times New Roman"/>
-          <w:color w:val="000000"/>
-          <w:sz w:val="24"/>
-          <w:szCs w:val="24"/>
-          <w:lang w:val="ru-RU"/>
-        </w:rPr>
-        <w:t>шестом задании от пользователя принимаются три части пути файловой системы, перечисленные через запятую без пробелов. Программе необходимо разделить эту строку на отдельные компоненты, после чего собрать их в единую строку пути,</w:t>
-      </w:r>
-      <w:r>
-        <w:rPr>
-          <w:rFonts w:ascii="Times New Roman" w:hAnsi="Times New Roman" w:cs="Times New Roman"/>
-          <w:color w:val="000000"/>
-          <w:sz w:val="24"/>
-          <w:szCs w:val="24"/>
-          <w:lang w:val="ru-RU"/>
-        </w:rPr>
-        <w:t xml:space="preserve"> </w:t>
-      </w:r>
-      <w:r>
-        <w:rPr>
-          <w:rFonts w:ascii="Times New Roman" w:hAnsi="Times New Roman" w:cs="Times New Roman"/>
-          <w:color w:val="000000"/>
-          <w:sz w:val="24"/>
-          <w:szCs w:val="24"/>
-          <w:lang w:val="ru-RU"/>
-        </w:rPr>
-        <w:t>используя в качестве разделителя каталогов прямую косую черту /.</w:t>
+          <w:sz w:val="24"/>
+          <w:szCs w:val="24"/>
+          <w:lang w:val="ru-RU"/>
+        </w:rPr>
+        <w:t>В пятом задании программа выполняет комплексный анализ введенного пользователем текстового идентификатора. Требуется определить полную длину строки, а также провести четыре независимые проверки: состоит ли строка только из букв, только из цифр, является ли буквенно-цифровой и содержит ли символ дефиса.</w:t>
       </w:r>
     </w:p>
     <w:p>
       <w:pPr>
         <w:spacing w:after="0" w:line="360" w:lineRule="auto"/>
         <w:ind w:firstLine="709"/>
+        <w:jc w:val="both"/>
         <w:rPr>
           <w:rFonts w:ascii="Times New Roman" w:hAnsi="Times New Roman" w:cs="Times New Roman"/>
           <w:color w:val="000000"/>
@@ -3254,17 +2598,36 @@
           <w:szCs w:val="24"/>
           <w:lang w:val="ru-RU"/>
         </w:rPr>
-        <w:t>Алгоритм решения задания представлен на рисунке 11.</w:t>
+        <w:t xml:space="preserve">Алгоритм решения задания представлен на рисунке </w:t>
+      </w:r>
+      <w:r>
+        <w:rPr>
+          <w:rFonts w:ascii="Times New Roman" w:hAnsi="Times New Roman" w:cs="Times New Roman"/>
+          <w:color w:val="000000"/>
+          <w:sz w:val="24"/>
+          <w:szCs w:val="24"/>
+          <w:lang w:val="ru-RU"/>
+        </w:rPr>
+        <w:t>9</w:t>
+      </w:r>
+      <w:r>
+        <w:rPr>
+          <w:rFonts w:ascii="Times New Roman" w:hAnsi="Times New Roman" w:cs="Times New Roman"/>
+          <w:color w:val="000000"/>
+          <w:sz w:val="24"/>
+          <w:szCs w:val="24"/>
+          <w:lang w:val="ru-RU"/>
+        </w:rPr>
+        <w:t>.</w:t>
       </w:r>
     </w:p>
     <w:p>
       <w:pPr>
-        <w:spacing w:after="0" w:line="360" w:lineRule="auto"/>
+        <w:spacing w:after="80" w:line="360" w:lineRule="auto"/>
         <w:ind w:firstLine="709"/>
         <w:jc w:val="center"/>
         <w:rPr>
           <w:rFonts w:ascii="Times New Roman" w:hAnsi="Times New Roman" w:cs="Times New Roman"/>
-          <w:color w:val="000000"/>
           <w:sz w:val="24"/>
           <w:szCs w:val="24"/>
           <w:lang w:val="ru-RU"/>
@@ -3274,17 +2637,16 @@
         <w:rPr>
           <w:rFonts w:ascii="Times New Roman" w:hAnsi="Times New Roman" w:cs="Times New Roman"/>
           <w:noProof/>
-          <w:color w:val="000000"/>
           <w:sz w:val="24"/>
           <w:szCs w:val="24"/>
           <w:lang w:val="ru-RU"/>
         </w:rPr>
         <w:lastRenderedPageBreak/>
         <w:drawing>
-          <wp:inline distT="0" distB="0" distL="0" distR="0" wp14:anchorId="2B5219B7" wp14:editId="51EC78D8">
-            <wp:extent cx="1781175" cy="4781550"/>
-            <wp:effectExtent l="0" t="0" r="9525" b="0"/>
-            <wp:docPr id="14" name="Рисунок 14"/>
+          <wp:inline distT="0" distB="0" distL="0" distR="0" wp14:anchorId="3B594509" wp14:editId="04753323">
+            <wp:extent cx="2571750" cy="4686300"/>
+            <wp:effectExtent l="0" t="0" r="0" b="0"/>
+            <wp:docPr id="12" name="Рисунок 12"/>
             <wp:cNvGraphicFramePr>
               <a:graphicFrameLocks xmlns:a="http://schemas.openxmlformats.org/drawingml/2006/main" noChangeAspect="1"/>
             </wp:cNvGraphicFramePr>
@@ -3292,7 +2654,7 @@
               <a:graphicData uri="http://schemas.openxmlformats.org/drawingml/2006/picture">
                 <pic:pic xmlns:pic="http://schemas.openxmlformats.org/drawingml/2006/picture">
                   <pic:nvPicPr>
-                    <pic:cNvPr id="14" name="Рисунок 14"/>
+                    <pic:cNvPr id="12" name="Рисунок 12"/>
                     <pic:cNvPicPr/>
                   </pic:nvPicPr>
                   <pic:blipFill>
@@ -3304,7 +2666,7 @@
                   <pic:spPr>
                     <a:xfrm>
                       <a:off x="0" y="0"/>
-                      <a:ext cx="1781175" cy="4781550"/>
+                      <a:ext cx="2571750" cy="4686300"/>
                     </a:xfrm>
                     <a:prstGeom prst="rect">
                       <a:avLst/>
@@ -3333,12 +2695,29 @@
       <w:r>
         <w:rPr>
           <w:rFonts w:ascii="Times New Roman" w:hAnsi="Times New Roman" w:cs="Times New Roman"/>
-          <w:color w:val="000000"/>
-          <w:sz w:val="24"/>
-          <w:szCs w:val="24"/>
-          <w:lang w:val="ru-RU"/>
-        </w:rPr>
-        <w:t xml:space="preserve">Рисунок 11 </w:t>
+          <w:sz w:val="24"/>
+          <w:szCs w:val="24"/>
+          <w:lang w:val="ru-RU"/>
+        </w:rPr>
+        <w:t xml:space="preserve">Рисунок </w:t>
+      </w:r>
+      <w:r>
+        <w:rPr>
+          <w:rFonts w:ascii="Times New Roman" w:hAnsi="Times New Roman" w:cs="Times New Roman"/>
+          <w:sz w:val="24"/>
+          <w:szCs w:val="24"/>
+          <w:lang w:val="ru-RU"/>
+        </w:rPr>
+        <w:t>9</w:t>
+      </w:r>
+      <w:r>
+        <w:rPr>
+          <w:rFonts w:ascii="Times New Roman" w:hAnsi="Times New Roman" w:cs="Times New Roman"/>
+          <w:sz w:val="24"/>
+          <w:szCs w:val="24"/>
+          <w:lang w:val="ru-RU"/>
+        </w:rPr>
+        <w:t xml:space="preserve"> </w:t>
       </w:r>
       <w:r>
         <w:rPr>
@@ -3358,17 +2737,7 @@
           <w:szCs w:val="24"/>
           <w:lang w:val="ru-RU"/>
         </w:rPr>
-        <w:t xml:space="preserve"> </w:t>
-      </w:r>
-      <w:r>
-        <w:rPr>
-          <w:rFonts w:ascii="Times New Roman" w:hAnsi="Times New Roman"/>
-          <w:color w:val="000000"/>
-          <w:sz w:val="24"/>
-          <w:szCs w:val="24"/>
-          <w:lang w:val="ru-RU"/>
-        </w:rPr>
-        <w:t>Блок-схема программы</w:t>
+        <w:t xml:space="preserve"> Блок-схема программы</w:t>
       </w:r>
     </w:p>
     <w:p>
@@ -3377,50 +2746,69 @@
         <w:ind w:firstLine="709"/>
         <w:jc w:val="both"/>
         <w:rPr>
-          <w:rFonts w:ascii="Times New Roman" w:hAnsi="Times New Roman" w:cs="Times New Roman"/>
-          <w:color w:val="000000"/>
-          <w:sz w:val="24"/>
-          <w:szCs w:val="24"/>
-          <w:lang w:val="ru-RU"/>
-        </w:rPr>
-      </w:pPr>
-      <w:r>
-        <w:rPr>
-          <w:rFonts w:ascii="Times New Roman" w:hAnsi="Times New Roman" w:cs="Times New Roman"/>
-          <w:color w:val="000000"/>
-          <w:sz w:val="24"/>
-          <w:szCs w:val="24"/>
-          <w:lang w:val="ru-RU"/>
-        </w:rPr>
-        <w:t>Текст программы представлен на рисунке 12.</w:t>
+          <w:rFonts w:ascii="Times New Roman" w:hAnsi="Times New Roman"/>
+          <w:color w:val="000000"/>
+          <w:sz w:val="24"/>
+          <w:szCs w:val="24"/>
+          <w:lang w:val="ru-RU"/>
+        </w:rPr>
+      </w:pPr>
+      <w:r>
+        <w:rPr>
+          <w:rFonts w:ascii="Times New Roman" w:hAnsi="Times New Roman"/>
+          <w:color w:val="000000"/>
+          <w:sz w:val="24"/>
+          <w:szCs w:val="24"/>
+          <w:lang w:val="ru-RU"/>
+        </w:rPr>
+        <w:t xml:space="preserve">Текст программы предоставлен на рисунке </w:t>
+      </w:r>
+      <w:r>
+        <w:rPr>
+          <w:rFonts w:ascii="Times New Roman" w:hAnsi="Times New Roman"/>
+          <w:color w:val="000000"/>
+          <w:sz w:val="24"/>
+          <w:szCs w:val="24"/>
+          <w:lang w:val="ru-RU"/>
+        </w:rPr>
+        <w:t>10</w:t>
+      </w:r>
+      <w:r>
+        <w:rPr>
+          <w:rFonts w:ascii="Times New Roman" w:hAnsi="Times New Roman"/>
+          <w:color w:val="000000"/>
+          <w:sz w:val="24"/>
+          <w:szCs w:val="24"/>
+          <w:lang w:val="ru-RU"/>
+        </w:rPr>
+        <w:t>.</w:t>
       </w:r>
     </w:p>
     <w:p>
       <w:pPr>
-        <w:spacing w:after="120" w:line="360" w:lineRule="auto"/>
+        <w:spacing w:after="80" w:line="360" w:lineRule="auto"/>
         <w:ind w:firstLine="709"/>
         <w:jc w:val="center"/>
         <w:rPr>
-          <w:rFonts w:ascii="Arial" w:hAnsi="Arial" w:cs="Arial"/>
-          <w:color w:val="000000"/>
-          <w:sz w:val="26"/>
-          <w:szCs w:val="26"/>
-          <w:lang w:val="ru-RU"/>
-        </w:rPr>
-      </w:pPr>
-      <w:r>
-        <w:rPr>
-          <w:rFonts w:ascii="Arial" w:hAnsi="Arial" w:cs="Arial"/>
-          <w:color w:val="000000"/>
-          <w:sz w:val="26"/>
-          <w:szCs w:val="26"/>
-          <w:lang w:val="ru-RU"/>
-        </w:rPr>
+          <w:rFonts w:ascii="Times New Roman" w:hAnsi="Times New Roman" w:cs="Times New Roman"/>
+          <w:sz w:val="24"/>
+          <w:szCs w:val="24"/>
+          <w:lang w:val="ru-RU"/>
+        </w:rPr>
+      </w:pPr>
+      <w:r>
+        <w:rPr>
+          <w:rFonts w:ascii="Times New Roman" w:hAnsi="Times New Roman" w:cs="Times New Roman"/>
+          <w:sz w:val="24"/>
+          <w:szCs w:val="24"/>
+          <w:lang w:val="ru-RU"/>
+        </w:rPr>
+        <w:lastRenderedPageBreak/>
         <w:drawing>
-          <wp:inline distT="0" distB="0" distL="0" distR="0" wp14:anchorId="4D86EE05" wp14:editId="4C66162C">
-            <wp:extent cx="3915321" cy="1638529"/>
-            <wp:effectExtent l="0" t="0" r="0" b="0"/>
-            <wp:docPr id="15" name="Рисунок 15"/>
+          <wp:inline distT="0" distB="0" distL="0" distR="0" wp14:anchorId="0D0EA46F" wp14:editId="05C6F545">
+            <wp:extent cx="4582164" cy="3686689"/>
+            <wp:effectExtent l="0" t="0" r="8890" b="9525"/>
+            <wp:docPr id="13" name="Рисунок 13"/>
             <wp:cNvGraphicFramePr>
               <a:graphicFrameLocks xmlns:a="http://schemas.openxmlformats.org/drawingml/2006/main" noChangeAspect="1"/>
             </wp:cNvGraphicFramePr>
@@ -3440,6 +2828,618 @@
                   <pic:spPr>
                     <a:xfrm>
                       <a:off x="0" y="0"/>
+                      <a:ext cx="4582164" cy="3686689"/>
+                    </a:xfrm>
+                    <a:prstGeom prst="rect">
+                      <a:avLst/>
+                    </a:prstGeom>
+                  </pic:spPr>
+                </pic:pic>
+              </a:graphicData>
+            </a:graphic>
+          </wp:inline>
+        </w:drawing>
+      </w:r>
+    </w:p>
+    <w:p>
+      <w:pPr>
+        <w:spacing w:after="80" w:line="360" w:lineRule="auto"/>
+        <w:ind w:firstLine="709"/>
+        <w:jc w:val="center"/>
+        <w:rPr>
+          <w:rFonts w:ascii="Times New Roman" w:hAnsi="Times New Roman"/>
+          <w:color w:val="000000"/>
+          <w:sz w:val="24"/>
+          <w:szCs w:val="24"/>
+          <w:lang w:val="ru-RU"/>
+        </w:rPr>
+      </w:pPr>
+      <w:r>
+        <w:rPr>
+          <w:rFonts w:ascii="Times New Roman" w:hAnsi="Times New Roman" w:cs="Times New Roman"/>
+          <w:sz w:val="24"/>
+          <w:szCs w:val="24"/>
+          <w:lang w:val="ru-RU"/>
+        </w:rPr>
+        <w:t xml:space="preserve">Рисунок </w:t>
+      </w:r>
+      <w:r>
+        <w:rPr>
+          <w:rFonts w:ascii="Times New Roman" w:hAnsi="Times New Roman" w:cs="Times New Roman"/>
+          <w:sz w:val="24"/>
+          <w:szCs w:val="24"/>
+          <w:lang w:val="ru-RU"/>
+        </w:rPr>
+        <w:t>10</w:t>
+      </w:r>
+      <w:r>
+        <w:rPr>
+          <w:rFonts w:ascii="Times New Roman" w:hAnsi="Times New Roman" w:cs="Times New Roman"/>
+          <w:sz w:val="24"/>
+          <w:szCs w:val="24"/>
+          <w:lang w:val="ru-RU"/>
+        </w:rPr>
+        <w:t xml:space="preserve"> </w:t>
+      </w:r>
+      <w:r>
+        <w:rPr>
+          <w:rFonts w:ascii="Times New Roman" w:hAnsi="Times New Roman"/>
+          <w:color w:val="000000"/>
+          <w:sz w:val="24"/>
+          <w:szCs w:val="24"/>
+          <w:lang w:val="ru-RU"/>
+        </w:rPr>
+        <w:t>–</w:t>
+      </w:r>
+      <w:r>
+        <w:rPr>
+          <w:rFonts w:ascii="Times New Roman" w:hAnsi="Times New Roman"/>
+          <w:color w:val="000000"/>
+          <w:sz w:val="24"/>
+          <w:szCs w:val="24"/>
+          <w:lang w:val="ru-RU"/>
+        </w:rPr>
+        <w:t xml:space="preserve"> Текст программы </w:t>
+      </w:r>
+      <w:r>
+        <w:rPr>
+          <w:rFonts w:ascii="Times New Roman" w:hAnsi="Times New Roman"/>
+          <w:color w:val="000000"/>
+          <w:sz w:val="24"/>
+          <w:szCs w:val="24"/>
+        </w:rPr>
+        <w:t>task</w:t>
+      </w:r>
+      <w:r>
+        <w:rPr>
+          <w:rFonts w:ascii="Times New Roman" w:hAnsi="Times New Roman"/>
+          <w:color w:val="000000"/>
+          <w:sz w:val="24"/>
+          <w:szCs w:val="24"/>
+          <w:lang w:val="ru-RU"/>
+        </w:rPr>
+        <w:t>3</w:t>
+      </w:r>
+      <w:r>
+        <w:rPr>
+          <w:rFonts w:ascii="Times New Roman" w:hAnsi="Times New Roman"/>
+          <w:color w:val="000000"/>
+          <w:sz w:val="24"/>
+          <w:szCs w:val="24"/>
+          <w:lang w:val="ru-RU"/>
+        </w:rPr>
+        <w:t>5</w:t>
+      </w:r>
+      <w:r>
+        <w:rPr>
+          <w:rFonts w:ascii="Times New Roman" w:hAnsi="Times New Roman"/>
+          <w:color w:val="000000"/>
+          <w:sz w:val="24"/>
+          <w:szCs w:val="24"/>
+          <w:lang w:val="ru-RU"/>
+        </w:rPr>
+        <w:t>.</w:t>
+      </w:r>
+      <w:proofErr w:type="spellStart"/>
+      <w:r>
+        <w:rPr>
+          <w:rFonts w:ascii="Times New Roman" w:hAnsi="Times New Roman"/>
+          <w:color w:val="000000"/>
+          <w:sz w:val="24"/>
+          <w:szCs w:val="24"/>
+        </w:rPr>
+        <w:t>py</w:t>
+      </w:r>
+      <w:proofErr w:type="spellEnd"/>
+    </w:p>
+    <w:p>
+      <w:pPr>
+        <w:spacing w:after="0" w:line="360" w:lineRule="auto"/>
+        <w:ind w:firstLine="709"/>
+        <w:jc w:val="both"/>
+        <w:rPr>
+          <w:rFonts w:ascii="Times New Roman" w:hAnsi="Times New Roman" w:cs="Times New Roman"/>
+          <w:sz w:val="24"/>
+          <w:szCs w:val="24"/>
+        </w:rPr>
+      </w:pPr>
+      <w:r>
+        <w:rPr>
+          <w:rFonts w:ascii="Times New Roman" w:hAnsi="Times New Roman" w:cs="Times New Roman"/>
+          <w:sz w:val="24"/>
+          <w:szCs w:val="24"/>
+          <w:lang w:val="ru-RU"/>
+        </w:rPr>
+        <w:t xml:space="preserve">В данном задании для первых трех проверок используются встроенные логические (булевы) методы строк </w:t>
+      </w:r>
+      <w:proofErr w:type="spellStart"/>
+      <w:proofErr w:type="gramStart"/>
+      <w:r>
+        <w:rPr>
+          <w:rFonts w:ascii="Times New Roman" w:hAnsi="Times New Roman" w:cs="Times New Roman"/>
+          <w:sz w:val="24"/>
+          <w:szCs w:val="24"/>
+        </w:rPr>
+        <w:t>isalpha</w:t>
+      </w:r>
+      <w:proofErr w:type="spellEnd"/>
+      <w:r>
+        <w:rPr>
+          <w:rFonts w:ascii="Times New Roman" w:hAnsi="Times New Roman" w:cs="Times New Roman"/>
+          <w:sz w:val="24"/>
+          <w:szCs w:val="24"/>
+          <w:lang w:val="ru-RU"/>
+        </w:rPr>
+        <w:t>(</w:t>
+      </w:r>
+      <w:proofErr w:type="gramEnd"/>
+      <w:r>
+        <w:rPr>
+          <w:rFonts w:ascii="Times New Roman" w:hAnsi="Times New Roman" w:cs="Times New Roman"/>
+          <w:sz w:val="24"/>
+          <w:szCs w:val="24"/>
+          <w:lang w:val="ru-RU"/>
+        </w:rPr>
+        <w:t xml:space="preserve">), </w:t>
+      </w:r>
+      <w:proofErr w:type="spellStart"/>
+      <w:r>
+        <w:rPr>
+          <w:rFonts w:ascii="Times New Roman" w:hAnsi="Times New Roman" w:cs="Times New Roman"/>
+          <w:sz w:val="24"/>
+          <w:szCs w:val="24"/>
+        </w:rPr>
+        <w:t>isdigit</w:t>
+      </w:r>
+      <w:proofErr w:type="spellEnd"/>
+      <w:r>
+        <w:rPr>
+          <w:rFonts w:ascii="Times New Roman" w:hAnsi="Times New Roman" w:cs="Times New Roman"/>
+          <w:sz w:val="24"/>
+          <w:szCs w:val="24"/>
+          <w:lang w:val="ru-RU"/>
+        </w:rPr>
+        <w:t>() и</w:t>
+      </w:r>
+      <w:r>
+        <w:rPr>
+          <w:rFonts w:ascii="Times New Roman" w:hAnsi="Times New Roman" w:cs="Times New Roman"/>
+          <w:sz w:val="24"/>
+          <w:szCs w:val="24"/>
+          <w:lang w:val="ru-RU"/>
+        </w:rPr>
+        <w:t xml:space="preserve"> </w:t>
+      </w:r>
+      <w:proofErr w:type="spellStart"/>
+      <w:r>
+        <w:rPr>
+          <w:rFonts w:ascii="Times New Roman" w:hAnsi="Times New Roman" w:cs="Times New Roman"/>
+          <w:sz w:val="24"/>
+          <w:szCs w:val="24"/>
+        </w:rPr>
+        <w:t>isalnum</w:t>
+      </w:r>
+      <w:proofErr w:type="spellEnd"/>
+      <w:r>
+        <w:rPr>
+          <w:rFonts w:ascii="Times New Roman" w:hAnsi="Times New Roman" w:cs="Times New Roman"/>
+          <w:sz w:val="24"/>
+          <w:szCs w:val="24"/>
+          <w:lang w:val="ru-RU"/>
+        </w:rPr>
+        <w:t>()</w:t>
+      </w:r>
+      <w:r>
+        <w:rPr>
+          <w:rFonts w:ascii="Times New Roman" w:hAnsi="Times New Roman" w:cs="Times New Roman"/>
+          <w:sz w:val="24"/>
+          <w:szCs w:val="24"/>
+          <w:lang w:val="ru-RU"/>
+        </w:rPr>
+        <w:t xml:space="preserve">. Наличие дефиса проверяется с помощью оператора вхождения </w:t>
+      </w:r>
+      <w:proofErr w:type="spellStart"/>
+      <w:r>
+        <w:rPr>
+          <w:rFonts w:ascii="Times New Roman" w:hAnsi="Times New Roman" w:cs="Times New Roman"/>
+          <w:sz w:val="24"/>
+          <w:szCs w:val="24"/>
+          <w:lang w:val="ru-RU"/>
+        </w:rPr>
+        <w:t>in</w:t>
+      </w:r>
+      <w:proofErr w:type="spellEnd"/>
+      <w:r>
+        <w:rPr>
+          <w:rFonts w:ascii="Times New Roman" w:hAnsi="Times New Roman" w:cs="Times New Roman"/>
+          <w:sz w:val="24"/>
+          <w:szCs w:val="24"/>
+          <w:lang w:val="ru-RU"/>
+        </w:rPr>
+        <w:t xml:space="preserve">. Длина вычисляется базовой функцией </w:t>
+      </w:r>
+      <w:proofErr w:type="spellStart"/>
+      <w:proofErr w:type="gramStart"/>
+      <w:r>
+        <w:rPr>
+          <w:rFonts w:ascii="Times New Roman" w:hAnsi="Times New Roman" w:cs="Times New Roman"/>
+          <w:sz w:val="24"/>
+          <w:szCs w:val="24"/>
+          <w:lang w:val="ru-RU"/>
+        </w:rPr>
+        <w:t>len</w:t>
+      </w:r>
+      <w:proofErr w:type="spellEnd"/>
+      <w:r>
+        <w:rPr>
+          <w:rFonts w:ascii="Times New Roman" w:hAnsi="Times New Roman" w:cs="Times New Roman"/>
+          <w:sz w:val="24"/>
+          <w:szCs w:val="24"/>
+          <w:lang w:val="ru-RU"/>
+        </w:rPr>
+        <w:t>(</w:t>
+      </w:r>
+      <w:proofErr w:type="gramEnd"/>
+      <w:r>
+        <w:rPr>
+          <w:rFonts w:ascii="Times New Roman" w:hAnsi="Times New Roman" w:cs="Times New Roman"/>
+          <w:sz w:val="24"/>
+          <w:szCs w:val="24"/>
+          <w:lang w:val="ru-RU"/>
+        </w:rPr>
+        <w:t xml:space="preserve">). Все результаты выводятся в виде логических значений True или </w:t>
+      </w:r>
+      <w:r>
+        <w:rPr>
+          <w:rFonts w:ascii="Times New Roman" w:hAnsi="Times New Roman" w:cs="Times New Roman"/>
+          <w:sz w:val="24"/>
+          <w:szCs w:val="24"/>
+        </w:rPr>
+        <w:t>False</w:t>
+      </w:r>
+      <w:r>
+        <w:rPr>
+          <w:rFonts w:ascii="Times New Roman" w:hAnsi="Times New Roman" w:cs="Times New Roman"/>
+          <w:sz w:val="24"/>
+          <w:szCs w:val="24"/>
+          <w:lang w:val="ru-RU"/>
+        </w:rPr>
+        <w:t>.</w:t>
+      </w:r>
+    </w:p>
+    <w:p>
+      <w:pPr>
+        <w:spacing w:before="240" w:after="120" w:line="240" w:lineRule="auto"/>
+        <w:ind w:firstLine="709"/>
+        <w:jc w:val="both"/>
+        <w:rPr>
+          <w:rFonts w:ascii="Arial" w:hAnsi="Arial" w:cs="Arial"/>
+          <w:color w:val="000000"/>
+          <w:sz w:val="26"/>
+          <w:szCs w:val="26"/>
+          <w:lang w:val="ru-RU"/>
+        </w:rPr>
+      </w:pPr>
+      <w:r>
+        <w:rPr>
+          <w:rFonts w:ascii="Arial" w:hAnsi="Arial" w:cs="Arial"/>
+          <w:color w:val="000000"/>
+          <w:sz w:val="26"/>
+          <w:szCs w:val="26"/>
+          <w:lang w:val="ru-RU"/>
+        </w:rPr>
+        <w:t>1.</w:t>
+      </w:r>
+      <w:r>
+        <w:rPr>
+          <w:rFonts w:ascii="Arial" w:hAnsi="Arial" w:cs="Arial"/>
+          <w:color w:val="000000"/>
+          <w:sz w:val="26"/>
+          <w:szCs w:val="26"/>
+          <w:lang w:val="ru-RU"/>
+        </w:rPr>
+        <w:t>6</w:t>
+      </w:r>
+      <w:r>
+        <w:rPr>
+          <w:rFonts w:ascii="Arial" w:hAnsi="Arial" w:cs="Arial"/>
+          <w:color w:val="000000"/>
+          <w:sz w:val="26"/>
+          <w:szCs w:val="26"/>
+          <w:lang w:val="ru-RU"/>
+        </w:rPr>
+        <w:t xml:space="preserve"> </w:t>
+      </w:r>
+      <w:r>
+        <w:rPr>
+          <w:rFonts w:ascii="Arial" w:hAnsi="Arial" w:cs="Arial"/>
+          <w:color w:val="000000"/>
+          <w:sz w:val="26"/>
+          <w:szCs w:val="26"/>
+          <w:lang w:val="ru-RU"/>
+        </w:rPr>
+        <w:t>Формирование пути</w:t>
+      </w:r>
+    </w:p>
+    <w:p>
+      <w:pPr>
+        <w:spacing w:after="0" w:line="360" w:lineRule="auto"/>
+        <w:ind w:firstLine="709"/>
+        <w:rPr>
+          <w:rFonts w:ascii="Times New Roman" w:hAnsi="Times New Roman" w:cs="Times New Roman"/>
+          <w:color w:val="000000"/>
+          <w:sz w:val="24"/>
+          <w:szCs w:val="24"/>
+          <w:lang w:val="ru-RU"/>
+        </w:rPr>
+      </w:pPr>
+      <w:r>
+        <w:rPr>
+          <w:rFonts w:ascii="Times New Roman" w:hAnsi="Times New Roman" w:cs="Times New Roman"/>
+          <w:color w:val="000000"/>
+          <w:sz w:val="24"/>
+          <w:szCs w:val="24"/>
+          <w:lang w:val="ru-RU"/>
+        </w:rPr>
+        <w:t xml:space="preserve">В </w:t>
+      </w:r>
+      <w:r>
+        <w:rPr>
+          <w:rFonts w:ascii="Times New Roman" w:hAnsi="Times New Roman" w:cs="Times New Roman"/>
+          <w:color w:val="000000"/>
+          <w:sz w:val="24"/>
+          <w:szCs w:val="24"/>
+          <w:lang w:val="ru-RU"/>
+        </w:rPr>
+        <w:t>шестом задании от пользователя принимаются три части пути файловой системы, перечисленные через запятую без пробелов. Программе необходимо разделить эту строку на отдельные компоненты, после чего собрать их в единую строку пути,</w:t>
+      </w:r>
+      <w:r>
+        <w:rPr>
+          <w:rFonts w:ascii="Times New Roman" w:hAnsi="Times New Roman" w:cs="Times New Roman"/>
+          <w:color w:val="000000"/>
+          <w:sz w:val="24"/>
+          <w:szCs w:val="24"/>
+          <w:lang w:val="ru-RU"/>
+        </w:rPr>
+        <w:t xml:space="preserve"> </w:t>
+      </w:r>
+      <w:r>
+        <w:rPr>
+          <w:rFonts w:ascii="Times New Roman" w:hAnsi="Times New Roman" w:cs="Times New Roman"/>
+          <w:color w:val="000000"/>
+          <w:sz w:val="24"/>
+          <w:szCs w:val="24"/>
+          <w:lang w:val="ru-RU"/>
+        </w:rPr>
+        <w:t>используя в качестве разделителя каталогов прямую косую черту /.</w:t>
+      </w:r>
+    </w:p>
+    <w:p>
+      <w:pPr>
+        <w:spacing w:after="0" w:line="360" w:lineRule="auto"/>
+        <w:ind w:firstLine="709"/>
+        <w:rPr>
+          <w:rFonts w:ascii="Times New Roman" w:hAnsi="Times New Roman" w:cs="Times New Roman"/>
+          <w:color w:val="000000"/>
+          <w:sz w:val="24"/>
+          <w:szCs w:val="24"/>
+          <w:lang w:val="ru-RU"/>
+        </w:rPr>
+      </w:pPr>
+      <w:r>
+        <w:rPr>
+          <w:rFonts w:ascii="Times New Roman" w:hAnsi="Times New Roman" w:cs="Times New Roman"/>
+          <w:color w:val="000000"/>
+          <w:sz w:val="24"/>
+          <w:szCs w:val="24"/>
+          <w:lang w:val="ru-RU"/>
+        </w:rPr>
+        <w:t>Алгоритм решения задания представлен на рисунке 11.</w:t>
+      </w:r>
+    </w:p>
+    <w:p>
+      <w:pPr>
+        <w:spacing w:after="0" w:line="360" w:lineRule="auto"/>
+        <w:ind w:firstLine="709"/>
+        <w:jc w:val="center"/>
+        <w:rPr>
+          <w:rFonts w:ascii="Times New Roman" w:hAnsi="Times New Roman" w:cs="Times New Roman"/>
+          <w:color w:val="000000"/>
+          <w:sz w:val="24"/>
+          <w:szCs w:val="24"/>
+          <w:lang w:val="ru-RU"/>
+        </w:rPr>
+      </w:pPr>
+      <w:r>
+        <w:rPr>
+          <w:rFonts w:ascii="Times New Roman" w:hAnsi="Times New Roman" w:cs="Times New Roman"/>
+          <w:noProof/>
+          <w:color w:val="000000"/>
+          <w:sz w:val="24"/>
+          <w:szCs w:val="24"/>
+          <w:lang w:val="ru-RU"/>
+        </w:rPr>
+        <w:lastRenderedPageBreak/>
+        <w:drawing>
+          <wp:inline distT="0" distB="0" distL="0" distR="0" wp14:anchorId="2B5219B7" wp14:editId="51EC78D8">
+            <wp:extent cx="1781175" cy="4781550"/>
+            <wp:effectExtent l="0" t="0" r="9525" b="0"/>
+            <wp:docPr id="14" name="Рисунок 14"/>
+            <wp:cNvGraphicFramePr>
+              <a:graphicFrameLocks xmlns:a="http://schemas.openxmlformats.org/drawingml/2006/main" noChangeAspect="1"/>
+            </wp:cNvGraphicFramePr>
+            <a:graphic xmlns:a="http://schemas.openxmlformats.org/drawingml/2006/main">
+              <a:graphicData uri="http://schemas.openxmlformats.org/drawingml/2006/picture">
+                <pic:pic xmlns:pic="http://schemas.openxmlformats.org/drawingml/2006/picture">
+                  <pic:nvPicPr>
+                    <pic:cNvPr id="14" name="Рисунок 14"/>
+                    <pic:cNvPicPr/>
+                  </pic:nvPicPr>
+                  <pic:blipFill>
+                    <a:blip r:embed="rId18"/>
+                    <a:stretch>
+                      <a:fillRect/>
+                    </a:stretch>
+                  </pic:blipFill>
+                  <pic:spPr>
+                    <a:xfrm>
+                      <a:off x="0" y="0"/>
+                      <a:ext cx="1781175" cy="4781550"/>
+                    </a:xfrm>
+                    <a:prstGeom prst="rect">
+                      <a:avLst/>
+                    </a:prstGeom>
+                  </pic:spPr>
+                </pic:pic>
+              </a:graphicData>
+            </a:graphic>
+          </wp:inline>
+        </w:drawing>
+      </w:r>
+    </w:p>
+    <w:p>
+      <w:pPr>
+        <w:spacing w:after="80" w:line="360" w:lineRule="auto"/>
+        <w:ind w:firstLine="709"/>
+        <w:jc w:val="center"/>
+        <w:rPr>
+          <w:rFonts w:ascii="Times New Roman" w:hAnsi="Times New Roman"/>
+          <w:color w:val="000000"/>
+          <w:sz w:val="24"/>
+          <w:szCs w:val="24"/>
+          <w:lang w:val="ru-RU"/>
+        </w:rPr>
+      </w:pPr>
+      <w:r>
+        <w:rPr>
+          <w:rFonts w:ascii="Times New Roman" w:hAnsi="Times New Roman" w:cs="Times New Roman"/>
+          <w:color w:val="000000"/>
+          <w:sz w:val="24"/>
+          <w:szCs w:val="24"/>
+          <w:lang w:val="ru-RU"/>
+        </w:rPr>
+        <w:t xml:space="preserve">Рисунок 11 </w:t>
+      </w:r>
+      <w:r>
+        <w:rPr>
+          <w:rFonts w:ascii="Times New Roman" w:hAnsi="Times New Roman"/>
+          <w:color w:val="000000"/>
+          <w:sz w:val="24"/>
+          <w:szCs w:val="24"/>
+          <w:lang w:val="ru-RU"/>
+        </w:rPr>
+        <w:t>–</w:t>
+      </w:r>
+      <w:r>
+        <w:rPr>
+          <w:rFonts w:ascii="Times New Roman" w:hAnsi="Times New Roman"/>
+          <w:color w:val="000000"/>
+          <w:sz w:val="24"/>
+          <w:szCs w:val="24"/>
+          <w:lang w:val="ru-RU"/>
+        </w:rPr>
+        <w:t xml:space="preserve"> </w:t>
+      </w:r>
+      <w:r>
+        <w:rPr>
+          <w:rFonts w:ascii="Times New Roman" w:hAnsi="Times New Roman"/>
+          <w:color w:val="000000"/>
+          <w:sz w:val="24"/>
+          <w:szCs w:val="24"/>
+          <w:lang w:val="ru-RU"/>
+        </w:rPr>
+        <w:t>Блок-схема программы</w:t>
+      </w:r>
+    </w:p>
+    <w:p>
+      <w:pPr>
+        <w:spacing w:after="0" w:line="360" w:lineRule="auto"/>
+        <w:ind w:firstLine="709"/>
+        <w:jc w:val="both"/>
+        <w:rPr>
+          <w:rFonts w:ascii="Times New Roman" w:hAnsi="Times New Roman" w:cs="Times New Roman"/>
+          <w:color w:val="000000"/>
+          <w:sz w:val="24"/>
+          <w:szCs w:val="24"/>
+          <w:lang w:val="ru-RU"/>
+        </w:rPr>
+      </w:pPr>
+      <w:r>
+        <w:rPr>
+          <w:rFonts w:ascii="Times New Roman" w:hAnsi="Times New Roman" w:cs="Times New Roman"/>
+          <w:color w:val="000000"/>
+          <w:sz w:val="24"/>
+          <w:szCs w:val="24"/>
+          <w:lang w:val="ru-RU"/>
+        </w:rPr>
+        <w:t>Текст программы представлен на рисунке 12.</w:t>
+      </w:r>
+    </w:p>
+    <w:p>
+      <w:pPr>
+        <w:spacing w:after="120" w:line="360" w:lineRule="auto"/>
+        <w:ind w:firstLine="709"/>
+        <w:jc w:val="center"/>
+        <w:rPr>
+          <w:rFonts w:ascii="Arial" w:hAnsi="Arial" w:cs="Arial"/>
+          <w:color w:val="000000"/>
+          <w:sz w:val="26"/>
+          <w:szCs w:val="26"/>
+          <w:lang w:val="ru-RU"/>
+        </w:rPr>
+      </w:pPr>
+      <w:r>
+        <w:rPr>
+          <w:rFonts w:ascii="Arial" w:hAnsi="Arial" w:cs="Arial"/>
+          <w:color w:val="000000"/>
+          <w:sz w:val="26"/>
+          <w:szCs w:val="26"/>
+          <w:lang w:val="ru-RU"/>
+        </w:rPr>
+        <w:drawing>
+          <wp:inline distT="0" distB="0" distL="0" distR="0" wp14:anchorId="4D86EE05" wp14:editId="4C66162C">
+            <wp:extent cx="3915321" cy="1638529"/>
+            <wp:effectExtent l="0" t="0" r="0" b="0"/>
+            <wp:docPr id="15" name="Рисунок 15"/>
+            <wp:cNvGraphicFramePr>
+              <a:graphicFrameLocks xmlns:a="http://schemas.openxmlformats.org/drawingml/2006/main" noChangeAspect="1"/>
+            </wp:cNvGraphicFramePr>
+            <a:graphic xmlns:a="http://schemas.openxmlformats.org/drawingml/2006/main">
+              <a:graphicData uri="http://schemas.openxmlformats.org/drawingml/2006/picture">
+                <pic:pic xmlns:pic="http://schemas.openxmlformats.org/drawingml/2006/picture">
+                  <pic:nvPicPr>
+                    <pic:cNvPr id="1" name=""/>
+                    <pic:cNvPicPr/>
+                  </pic:nvPicPr>
+                  <pic:blipFill>
+                    <a:blip r:embed="rId19"/>
+                    <a:stretch>
+                      <a:fillRect/>
+                    </a:stretch>
+                  </pic:blipFill>
+                  <pic:spPr>
+                    <a:xfrm>
+                      <a:off x="0" y="0"/>
                       <a:ext cx="3915321" cy="1638529"/>
                     </a:xfrm>
                     <a:prstGeom prst="rect">
@@ -3845,6 +3845,7 @@
       </w:r>
     </w:p>
     <w:sectPr>
+      <w:footerReference w:type="default" r:id="rId20"/>
       <w:pgSz w:w="12240" w:h="15840"/>
       <w:pgMar w:top="1123" w:right="850" w:bottom="1123" w:left="1699" w:header="720" w:footer="720" w:gutter="0"/>
       <w:cols w:space="720"/>
@@ -3852,6 +3853,72 @@
     </w:sectPr>
   </w:body>
 </w:document>
+</file>
+
+<file path=word/endnotes.xml><?xml version="1.0" encoding="utf-8"?>
+<w:endnotes xmlns:wpc="http://schemas.microsoft.com/office/word/2010/wordprocessingCanvas" xmlns:cx="http://schemas.microsoft.com/office/drawing/2014/chartex" xmlns:cx1="http://schemas.microsoft.com/office/drawing/2015/9/8/chartex" xmlns:cx2="http://schemas.microsoft.com/office/drawing/2015/10/21/chartex" xmlns:cx3="http://schemas.microsoft.com/office/drawing/2016/5/9/chartex" xmlns:cx4="http://schemas.microsoft.com/office/drawing/2016/5/10/chartex" xmlns:cx5="http://schemas.microsoft.com/office/drawing/2016/5/11/chartex" xmlns:cx6="http://schemas.microsoft.com/office/drawing/2016/5/12/chartex" xmlns:cx7="http://schemas.microsoft.com/office/drawing/2016/5/13/chartex" xmlns:cx8="http://schemas.microsoft.com/office/drawing/2016/5/14/chartex" xmlns:mc="http://schemas.openxmlformats.org/markup-compatibility/2006" xmlns:aink="http://schemas.microsoft.com/office/drawing/2016/ink" xmlns:am3d="http://schemas.microsoft.com/office/drawing/2017/model3d" xmlns:o="urn:schemas-microsoft-com:office:office" xmlns:oel="http://schemas.microsoft.com/office/2019/extlst" xmlns:r="http://schemas.openxmlformats.org/officeDocument/2006/relationships" xmlns:m="http://schemas.openxmlformats.org/officeDocument/2006/math" xmlns:v="urn:schemas-microsoft-com:vml" xmlns:wp14="http://schemas.microsoft.com/office/word/2010/wordprocessingDrawing" xmlns:wp="http://schemas.openxmlformats.org/drawingml/2006/wordprocessingDrawing" xmlns:w10="urn:schemas-microsoft-com:office:word" xmlns:w="http://schemas.openxmlformats.org/wordprocessingml/2006/main" xmlns:w14="http://schemas.microsoft.com/office/word/2010/wordml" xmlns:w15="http://schemas.microsoft.com/office/word/2012/wordml" xmlns:w16cex="http://schemas.microsoft.com/office/word/2018/wordml/cex" xmlns:w16cid="http://schemas.microsoft.com/office/word/2016/wordml/cid" xmlns:w16="http://schemas.microsoft.com/office/word/2018/wordml" xmlns:w16sdtdh="http://schemas.microsoft.com/office/word/2020/wordml/sdtdatahash" xmlns:w16se="http://schemas.microsoft.com/office/word/2015/wordml/symex" xmlns:wpg="http://schemas.microsoft.com/office/word/2010/wordprocessingGroup" xmlns:wpi="http://schemas.microsoft.com/office/word/2010/wordprocessingInk" xmlns:wne="http://schemas.microsoft.com/office/word/2006/wordml" xmlns:wps="http://schemas.microsoft.com/office/word/2010/wordprocessingShape" mc:Ignorable="w14 w15 w16se w16cid w16 w16cex w16sdtdh wp14">
+  <w:endnote w:type="separator" w:id="-1">
+    <w:p>
+      <w:pPr>
+        <w:spacing w:after="0" w:line="240" w:lineRule="auto"/>
+      </w:pPr>
+      <w:r>
+        <w:separator/>
+      </w:r>
+    </w:p>
+  </w:endnote>
+  <w:endnote w:type="continuationSeparator" w:id="0">
+    <w:p>
+      <w:pPr>
+        <w:spacing w:after="0" w:line="240" w:lineRule="auto"/>
+      </w:pPr>
+      <w:r>
+        <w:continuationSeparator/>
+      </w:r>
+    </w:p>
+  </w:endnote>
+</w:endnotes>
+</file>
+
+<file path=word/footer1.xml><?xml version="1.0" encoding="utf-8"?>
+<w:ftr xmlns:wpc="http://schemas.microsoft.com/office/word/2010/wordprocessingCanvas" xmlns:cx="http://schemas.microsoft.com/office/drawing/2014/chartex" xmlns:cx1="http://schemas.microsoft.com/office/drawing/2015/9/8/chartex" xmlns:cx2="http://schemas.microsoft.com/office/drawing/2015/10/21/chartex" xmlns:cx3="http://schemas.microsoft.com/office/drawing/2016/5/9/chartex" xmlns:cx4="http://schemas.microsoft.com/office/drawing/2016/5/10/chartex" xmlns:cx5="http://schemas.microsoft.com/office/drawing/2016/5/11/chartex" xmlns:cx6="http://schemas.microsoft.com/office/drawing/2016/5/12/chartex" xmlns:cx7="http://schemas.microsoft.com/office/drawing/2016/5/13/chartex" xmlns:cx8="http://schemas.microsoft.com/office/drawing/2016/5/14/chartex" xmlns:mc="http://schemas.openxmlformats.org/markup-compatibility/2006" xmlns:aink="http://schemas.microsoft.com/office/drawing/2016/ink" xmlns:am3d="http://schemas.microsoft.com/office/drawing/2017/model3d" xmlns:o="urn:schemas-microsoft-com:office:office" xmlns:oel="http://schemas.microsoft.com/office/2019/extlst" xmlns:r="http://schemas.openxmlformats.org/officeDocument/2006/relationships" xmlns:m="http://schemas.openxmlformats.org/officeDocument/2006/math" xmlns:v="urn:schemas-microsoft-com:vml" xmlns:wp14="http://schemas.microsoft.com/office/word/2010/wordprocessingDrawing" xmlns:wp="http://schemas.openxmlformats.org/drawingml/2006/wordprocessingDrawing" xmlns:w10="urn:schemas-microsoft-com:office:word" xmlns:w="http://schemas.openxmlformats.org/wordprocessingml/2006/main" xmlns:w14="http://schemas.microsoft.com/office/word/2010/wordml" xmlns:w15="http://schemas.microsoft.com/office/word/2012/wordml" xmlns:w16cex="http://schemas.microsoft.com/office/word/2018/wordml/cex" xmlns:w16cid="http://schemas.microsoft.com/office/word/2016/wordml/cid" xmlns:w16="http://schemas.microsoft.com/office/word/2018/wordml" xmlns:w16sdtdh="http://schemas.microsoft.com/office/word/2020/wordml/sdtdatahash" xmlns:w16se="http://schemas.microsoft.com/office/word/2015/wordml/symex" xmlns:wpg="http://schemas.microsoft.com/office/word/2010/wordprocessingGroup" xmlns:wpi="http://schemas.microsoft.com/office/word/2010/wordprocessingInk" xmlns:wne="http://schemas.microsoft.com/office/word/2006/wordml" xmlns:wps="http://schemas.microsoft.com/office/word/2010/wordprocessingShape" mc:Ignorable="w14 w15 w16se w16cid w16 w16cex w16sdtdh wp14">
+  <w:p>
+    <w:pPr>
+      <w:pStyle w:val="a7"/>
+      <w:jc w:val="center"/>
+    </w:pPr>
+  </w:p>
+  <w:p>
+    <w:pPr>
+      <w:pStyle w:val="a7"/>
+    </w:pPr>
+  </w:p>
+</w:ftr>
+</file>
+
+<file path=word/footnotes.xml><?xml version="1.0" encoding="utf-8"?>
+<w:footnotes xmlns:wpc="http://schemas.microsoft.com/office/word/2010/wordprocessingCanvas" xmlns:cx="http://schemas.microsoft.com/office/drawing/2014/chartex" xmlns:cx1="http://schemas.microsoft.com/office/drawing/2015/9/8/chartex" xmlns:cx2="http://schemas.microsoft.com/office/drawing/2015/10/21/chartex" xmlns:cx3="http://schemas.microsoft.com/office/drawing/2016/5/9/chartex" xmlns:cx4="http://schemas.microsoft.com/office/drawing/2016/5/10/chartex" xmlns:cx5="http://schemas.microsoft.com/office/drawing/2016/5/11/chartex" xmlns:cx6="http://schemas.microsoft.com/office/drawing/2016/5/12/chartex" xmlns:cx7="http://schemas.microsoft.com/office/drawing/2016/5/13/chartex" xmlns:cx8="http://schemas.microsoft.com/office/drawing/2016/5/14/chartex" xmlns:mc="http://schemas.openxmlformats.org/markup-compatibility/2006" xmlns:aink="http://schemas.microsoft.com/office/drawing/2016/ink" xmlns:am3d="http://schemas.microsoft.com/office/drawing/2017/model3d" xmlns:o="urn:schemas-microsoft-com:office:office" xmlns:oel="http://schemas.microsoft.com/office/2019/extlst" xmlns:r="http://schemas.openxmlformats.org/officeDocument/2006/relationships" xmlns:m="http://schemas.openxmlformats.org/officeDocument/2006/math" xmlns:v="urn:schemas-microsoft-com:vml" xmlns:wp14="http://schemas.microsoft.com/office/word/2010/wordprocessingDrawing" xmlns:wp="http://schemas.openxmlformats.org/drawingml/2006/wordprocessingDrawing" xmlns:w10="urn:schemas-microsoft-com:office:word" xmlns:w="http://schemas.openxmlformats.org/wordprocessingml/2006/main" xmlns:w14="http://schemas.microsoft.com/office/word/2010/wordml" xmlns:w15="http://schemas.microsoft.com/office/word/2012/wordml" xmlns:w16cex="http://schemas.microsoft.com/office/word/2018/wordml/cex" xmlns:w16cid="http://schemas.microsoft.com/office/word/2016/wordml/cid" xmlns:w16="http://schemas.microsoft.com/office/word/2018/wordml" xmlns:w16sdtdh="http://schemas.microsoft.com/office/word/2020/wordml/sdtdatahash" xmlns:w16se="http://schemas.microsoft.com/office/word/2015/wordml/symex" xmlns:wpg="http://schemas.microsoft.com/office/word/2010/wordprocessingGroup" xmlns:wpi="http://schemas.microsoft.com/office/word/2010/wordprocessingInk" xmlns:wne="http://schemas.microsoft.com/office/word/2006/wordml" xmlns:wps="http://schemas.microsoft.com/office/word/2010/wordprocessingShape" mc:Ignorable="w14 w15 w16se w16cid w16 w16cex w16sdtdh wp14">
+  <w:footnote w:type="separator" w:id="-1">
+    <w:p>
+      <w:pPr>
+        <w:spacing w:after="0" w:line="240" w:lineRule="auto"/>
+      </w:pPr>
+      <w:r>
+        <w:separator/>
+      </w:r>
+    </w:p>
+  </w:footnote>
+  <w:footnote w:type="continuationSeparator" w:id="0">
+    <w:p>
+      <w:pPr>
+        <w:spacing w:after="0" w:line="240" w:lineRule="auto"/>
+      </w:pPr>
+      <w:r>
+        <w:continuationSeparator/>
+      </w:r>
+    </w:p>
+  </w:footnote>
+</w:footnotes>
 </file>
 
 <file path=word/numbering.xml><?xml version="1.0" encoding="utf-8"?>

</xml_diff>